<commit_message>
Add Version 1 conference paper, Version 2 calibration docs, and PhD progress report
</commit_message>
<xml_diff>
--- a/paper_1/PACER_Paper1_FINAL_v2.docx
+++ b/paper_1/PACER_Paper1_FINAL_v2.docx
@@ -1,6 +1,6 @@
 
 <file path=word/document.xml><?xml version="1.0" encoding="utf-8"?>
-<w:document xmlns:wpc="http://schemas.microsoft.com/office/word/2010/wordprocessingCanvas" xmlns:cx="http://schemas.microsoft.com/office/drawing/2014/chartex" xmlns:cx1="http://schemas.microsoft.com/office/drawing/2015/9/8/chartex" xmlns:cx2="http://schemas.microsoft.com/office/drawing/2015/10/21/chartex" xmlns:cx3="http://schemas.microsoft.com/office/drawing/2016/5/9/chartex" xmlns:cx4="http://schemas.microsoft.com/office/drawing/2016/5/10/chartex" xmlns:cx5="http://schemas.microsoft.com/office/drawing/2016/5/11/chartex" xmlns:cx6="http://schemas.microsoft.com/office/drawing/2016/5/12/chartex" xmlns:cx7="http://schemas.microsoft.com/office/drawing/2016/5/13/chartex" xmlns:cx8="http://schemas.microsoft.com/office/drawing/2016/5/14/chartex" xmlns:mc="http://schemas.openxmlformats.org/markup-compatibility/2006" xmlns:aink="http://schemas.microsoft.com/office/drawing/2016/ink" xmlns:am3d="http://schemas.microsoft.com/office/drawing/2017/model3d" xmlns:o="urn:schemas-microsoft-com:office:office" xmlns:oel="http://schemas.microsoft.com/office/2019/extlst" xmlns:r="http://schemas.openxmlformats.org/officeDocument/2006/relationships" xmlns:m="http://schemas.openxmlformats.org/officeDocument/2006/math" xmlns:v="urn:schemas-microsoft-com:vml" xmlns:wp14="http://schemas.microsoft.com/office/word/2010/wordprocessingDrawing" xmlns:wp="http://schemas.openxmlformats.org/drawingml/2006/wordprocessingDrawing" xmlns:w10="urn:schemas-microsoft-com:office:word" xmlns:w="http://schemas.openxmlformats.org/wordprocessingml/2006/main" xmlns:w14="http://schemas.microsoft.com/office/word/2010/wordml" xmlns:w15="http://schemas.microsoft.com/office/word/2012/wordml" xmlns:w16cex="http://schemas.microsoft.com/office/word/2018/wordml/cex" xmlns:w16cid="http://schemas.microsoft.com/office/word/2016/wordml/cid" xmlns:w16="http://schemas.microsoft.com/office/word/2018/wordml" xmlns:w16du="http://schemas.microsoft.com/office/word/2023/wordml/word16du" xmlns:w16sdtdh="http://schemas.microsoft.com/office/word/2020/wordml/sdtdatahash" xmlns:w16sdtfl="http://schemas.microsoft.com/office/word/2024/wordml/sdtformatlock" xmlns:w16se="http://schemas.microsoft.com/office/word/2015/wordml/symex" xmlns:wpg="http://schemas.microsoft.com/office/word/2010/wordprocessingGroup" xmlns:wpi="http://schemas.microsoft.com/office/word/2010/wordprocessingInk" xmlns:wne="http://schemas.microsoft.com/office/word/2006/wordml" xmlns:wps="http://schemas.microsoft.com/office/word/2010/wordprocessingShape" mc:Ignorable="w14 w15 w16se w16cid w16 w16cex w16sdtdh w16sdtfl w16du wp14">
+<w:document xmlns:wpc="http://schemas.microsoft.com/office/word/2010/wordprocessingCanvas" xmlns:cx="http://schemas.microsoft.com/office/drawing/2014/chartex" xmlns:cx1="http://schemas.microsoft.com/office/drawing/2015/9/8/chartex" xmlns:cx2="http://schemas.microsoft.com/office/drawing/2015/10/21/chartex" xmlns:cx3="http://schemas.microsoft.com/office/drawing/2016/5/9/chartex" xmlns:cx4="http://schemas.microsoft.com/office/drawing/2016/5/10/chartex" xmlns:cx5="http://schemas.microsoft.com/office/drawing/2016/5/11/chartex" xmlns:cx6="http://schemas.microsoft.com/office/drawing/2016/5/12/chartex" xmlns:cx7="http://schemas.microsoft.com/office/drawing/2016/5/13/chartex" xmlns:cx8="http://schemas.microsoft.com/office/drawing/2016/5/14/chartex" xmlns:mc="http://schemas.openxmlformats.org/markup-compatibility/2006" xmlns:m="http://schemas.openxmlformats.org/officeDocument/2006/math" xmlns:aink="http://schemas.microsoft.com/office/drawing/2016/ink" xmlns:am3d="http://schemas.microsoft.com/office/drawing/2017/model3d" xmlns:oel="http://schemas.microsoft.com/office/2019/extlst" xmlns:r="http://schemas.openxmlformats.org/officeDocument/2006/relationships" xmlns:wp14="http://schemas.microsoft.com/office/word/2010/wordprocessingDrawing" xmlns:wp="http://schemas.openxmlformats.org/drawingml/2006/wordprocessingDrawing" xmlns:wpg="http://schemas.microsoft.com/office/word/2010/wordprocessingGroup" xmlns:wpi="http://schemas.microsoft.com/office/word/2010/wordprocessingInk" xmlns:wps="http://schemas.microsoft.com/office/word/2010/wordprocessingShape" xmlns:o="urn:schemas-microsoft-com:office:office" xmlns:v="urn:schemas-microsoft-com:vml" xmlns:w10="urn:schemas-microsoft-com:office:word" xmlns:w="http://schemas.openxmlformats.org/wordprocessingml/2006/main" xmlns:w14="http://schemas.microsoft.com/office/word/2010/wordml" xmlns:w15="http://schemas.microsoft.com/office/word/2012/wordml" xmlns:w16cei="http://schemas.microsoft.com/office/word/2026/wordml/cei" xmlns:w16cex="http://schemas.microsoft.com/office/word/2018/wordml/cex" xmlns:w16cid="http://schemas.microsoft.com/office/word/2016/wordml/cid" xmlns:w16="http://schemas.microsoft.com/office/word/2018/wordml" xmlns:w16sdtdh="http://schemas.microsoft.com/office/word/2020/wordml/sdtdatahash" xmlns:w16sdtfl="http://schemas.microsoft.com/office/word/2024/wordml/sdtformatlock" xmlns:w16se="http://schemas.microsoft.com/office/word/2015/wordml/symex" xmlns:w16du="http://schemas.microsoft.com/office/word/2023/wordml/word16du" xmlns:wne="http://schemas.microsoft.com/office/word/2006/wordml" mc:Ignorable="w14 w15 w16se w16cid w16 w16cex w16sdtdh w16sdtfl w16du wp14">
   <w:body>
     <w:p>
       <w:pPr>
@@ -112,23 +112,19 @@
         <w:jc w:val="both"/>
       </w:pPr>
       <w:r>
-        <w:t xml:space="preserve">The PACER codebase, evaluation benchmark (798 questions across 134 NCERT chapters), and CAS implementation will be released at </w:t>
-      </w:r>
-      <w:proofErr w:type="gramStart"/>
-      <w:r>
-        <w:t>https://github.com/[</w:t>
-      </w:r>
-      <w:proofErr w:type="gramEnd"/>
-      <w:r>
-        <w:t>upon acceptance].</w:t>
-      </w:r>
-    </w:p>
-    <w:p>
-      <w:pPr>
-        <w:pStyle w:val="Normal"/>
-      </w:pPr>
-      <w:r>
-        <w:t xml:space="preserve">Keywords: retrieval-augmented generation; document chunking; educational AI; curriculum alignment; NCERT; pedagogical boundary detection; Bloom's taxonomy; information retrieval</w:t>
+        <w:lastRenderedPageBreak/>
+        <w:t>The PACER codebase, evaluation benchmark (798 questions across 134 NCERT chapters), and CAS implementation will be released at https://github.com</w:t>
+      </w:r>
+      <w:r>
+        <w:t>/nitesh19s/edullm-pacer</w:t>
+      </w:r>
+      <w:r>
+        <w:t>.</w:t>
+      </w:r>
+    </w:p>
+    <w:p>
+      <w:r>
+        <w:t>Keywords: retrieval-augmented generation; document chunking; educational AI; curriculum alignment; NCERT; pedagogical boundary detection; Bloom's taxonomy; information retrieval</w:t>
       </w:r>
     </w:p>
     <w:p>
@@ -188,6 +184,7 @@
         <w:jc w:val="both"/>
       </w:pPr>
       <w:r>
+        <w:lastRenderedPageBreak/>
         <w:t>Our ablation results confirm this empirically: removing PACER’s boundary detector increases P@1 from 0.793 to 0.826 — standard metrics report an improvement — but CAS analysis reveals retrieved chunks are simultaneously less grade-appropriate and less aligned with prerequisite structure. This finding motivates the central contribution of this paper: a metric that makes the retrieval-pedagogy trade-off visible and quantifiable.</w:t>
       </w:r>
     </w:p>
@@ -249,7 +246,11 @@
         <w:jc w:val="both"/>
       </w:pPr>
       <w:r>
-        <w:t>(3) Curriculum Alignment Score (CAS). A three-component metric scoring whether retrieved chunks match the query's expected grade level (GradeMatch), prerequisite knowledge assumptions (PrereqPreservation), and cognitive demand (BloomAlignment) [35]. Validated across three independent LLM judges from different model families, achieving mean Fleiss' κ = 0.546.</w:t>
+        <w:t xml:space="preserve">(3) Curriculum Alignment Score (CAS). A three-component metric scoring whether retrieved chunks match the query's expected grade level (GradeMatch), prerequisite knowledge assumptions (PrereqPreservation), and cognitive demand (BloomAlignment) [35]. Validated </w:t>
+      </w:r>
+      <w:r>
+        <w:lastRenderedPageBreak/>
+        <w:t>across three independent LLM judges from different model families, achieving mean Fleiss' κ = 0.546.</w:t>
       </w:r>
     </w:p>
     <w:p>
@@ -289,7 +290,7 @@
           <w:noProof/>
         </w:rPr>
         <w:drawing>
-          <wp:inline distT="0" distB="0" distL="0" distR="0" wp14:anchorId="1499EBC1" wp14:editId="387D7A75">
+          <wp:inline distT="0" distB="0" distL="0" distR="0" wp14:anchorId="1499EBC1" wp14:editId="22F7C45A">
             <wp:extent cx="5731510" cy="4449445"/>
             <wp:effectExtent l="0" t="0" r="0" b="0"/>
             <wp:docPr id="375126363" name="Picture 14"/>
@@ -407,6 +408,7 @@
         <w:jc w:val="both"/>
       </w:pPr>
       <w:r>
+        <w:lastRenderedPageBreak/>
         <w:t>How you split a document before indexing turns out to matter enormously. Lewis et al. [1] established RAG as viable for knowledge-intensive tasks but used fixed-size chunking as a baseline convenience — pedagogical effects were not their concern. Since then, several splitting strategies have been explored. Fixed-size chunking with overlapping windows is still the most common default because it is simple and requires no document understanding [2]. Recursive character splitting, as implemented in LangChain, places boundaries at natural text delimiters but ignores whether those boundaries make semantic sense [5].</w:t>
       </w:r>
     </w:p>
@@ -451,6 +453,7 @@
         <w:jc w:val="both"/>
       </w:pPr>
       <w:r>
+        <w:lastRenderedPageBreak/>
         <w:t>Zhong et al. [23] showed that privacy-preserving local LLM deployment can match cloud performance on structured educational content — directly relevant to PACER's DPDP-compliant design. Maurya et al. [29] benchmarked LLMs as maths tutors across eight pedagogical dimensions and confirmed that standard QA metrics miss most of what matters for tutoring quality. None of these systems implement boundary detection during chunking, and none propose a validated curriculum alignment metric.</w:t>
       </w:r>
     </w:p>
@@ -511,6 +514,7 @@
         <w:jc w:val="both"/>
       </w:pPr>
       <w:r>
+        <w:lastRenderedPageBreak/>
         <w:t>Bloom's revised taxonomy [35] organises cognitive demand into six levels — Remember, Understand, Apply, Analyse, Evaluate, Create — and is widely used in CBSE curriculum design. Huber and Niklaus [36] showed that existing LLM benchmarks heavily skew toward the two lowest levels and rarely probe higher-order thinking. Scaria et al. [30] found that LLMs can generate Bloom-labelled questions when explicitly prompted, but agreement across models is uneven and varies with difficulty level. Our BloomAlignment dimension in CAS operationalises cognitive-level appropriateness as a retrieval criterion — to our knowledge, the first time this has been done.</w:t>
       </w:r>
     </w:p>
@@ -570,6 +574,7 @@
         <w:pStyle w:val="Heading2"/>
       </w:pPr>
       <w:r>
+        <w:lastRenderedPageBreak/>
         <w:t>3.3 Pedagogical boundary detector</w:t>
       </w:r>
     </w:p>
@@ -777,7 +782,11 @@
         <w:jc w:val="both"/>
       </w:pPr>
       <w:r>
-        <w:t>where α + β + γ = 1. Calibrated weights α = 0.45 (grade match), β = 0.40 (prerequisite preservation), γ = 0.15 (Bloom alignment) are used in all experiments, derived by κ-weighted optimisation across 150 LLM-judge-rated query-chunk pairs. These weights reflect the higher inter-judge reliability for grade appropriateness (κ = 0.587) and prerequisite coverage (κ = 0.611) compared to Bloom alignment (κ = 0.439). Human expert validation is ongoing; final weights will be confirmed in the camera-ready version.</w:t>
+        <w:t xml:space="preserve">where α + β + γ = 1. Calibrated weights α = 0.45 (grade match), β = 0.40 (prerequisite preservation), γ = 0.15 (Bloom alignment) are used in all experiments, derived by κ-weighted optimisation across 150 LLM-judge-rated query-chunk pairs. These weights reflect the higher </w:t>
+      </w:r>
+      <w:r>
+        <w:lastRenderedPageBreak/>
+        <w:t>inter-judge reliability for grade appropriateness (κ = 0.587) and prerequisite coverage (κ = 0.611) compared to Bloom alignment (κ = 0.439). Human expert validation is ongoing; final weights will be confirmed in the camera-ready version.</w:t>
       </w:r>
     </w:p>
     <w:p>
@@ -810,7 +819,6 @@
           <w:b/>
           <w:bCs/>
         </w:rPr>
-        <w:lastRenderedPageBreak/>
         <w:t>BloomAlignment</w:t>
       </w:r>
       <w:proofErr w:type="spellEnd"/>
@@ -909,6 +917,7 @@
           <w:i/>
           <w:iCs/>
         </w:rPr>
+        <w:lastRenderedPageBreak/>
         <w:t xml:space="preserve">Instruction: </w:t>
       </w:r>
       <w:r>
@@ -1155,9 +1164,28 @@
                 <w:sz w:val="20"/>
                 <w:szCs w:val="20"/>
               </w:rPr>
-              <w:t>Avg chars/</w:t>
-            </w:r>
-            <w:proofErr w:type="spellStart"/>
+              <w:t>Avg chars/ch.</w:t>
+            </w:r>
+          </w:p>
+        </w:tc>
+        <w:tc>
+          <w:tcPr>
+            <w:tcW w:w="1563" w:type="dxa"/>
+            <w:tcBorders>
+              <w:top w:val="single" w:sz="1" w:space="0" w:color="BBBBBB"/>
+              <w:left w:val="single" w:sz="1" w:space="0" w:color="BBBBBB"/>
+              <w:bottom w:val="single" w:sz="1" w:space="0" w:color="BBBBBB"/>
+              <w:right w:val="single" w:sz="1" w:space="0" w:color="BBBBBB"/>
+            </w:tcBorders>
+            <w:shd w:val="clear" w:color="auto" w:fill="EBEBEB"/>
+            <w:tcMar>
+              <w:top w:w="60" w:type="dxa"/>
+              <w:left w:w="100" w:type="dxa"/>
+              <w:bottom w:w="60" w:type="dxa"/>
+              <w:right w:w="100" w:type="dxa"/>
+            </w:tcMar>
+          </w:tcPr>
+          <w:p>
             <w:r>
               <w:rPr>
                 <w:b/>
@@ -1165,21 +1193,495 @@
                 <w:sz w:val="20"/>
                 <w:szCs w:val="20"/>
               </w:rPr>
-              <w:t>ch.</w:t>
-            </w:r>
-            <w:proofErr w:type="spellEnd"/>
-          </w:p>
-        </w:tc>
-        <w:tc>
-          <w:tcPr>
-            <w:tcW w:w="1563" w:type="dxa"/>
-            <w:tcBorders>
-              <w:top w:val="single" w:sz="1" w:space="0" w:color="BBBBBB"/>
-              <w:left w:val="single" w:sz="1" w:space="0" w:color="BBBBBB"/>
-              <w:bottom w:val="single" w:sz="1" w:space="0" w:color="BBBBBB"/>
-              <w:right w:val="single" w:sz="1" w:space="0" w:color="BBBBBB"/>
-            </w:tcBorders>
-            <w:shd w:val="clear" w:color="auto" w:fill="EBEBEB"/>
+              <w:t>Avg tokens/ch.</w:t>
+            </w:r>
+          </w:p>
+        </w:tc>
+      </w:tr>
+      <w:tr>
+        <w:tc>
+          <w:tcPr>
+            <w:tcW w:w="1300" w:type="dxa"/>
+            <w:tcBorders>
+              <w:top w:val="single" w:sz="1" w:space="0" w:color="BBBBBB"/>
+              <w:left w:val="single" w:sz="1" w:space="0" w:color="BBBBBB"/>
+              <w:bottom w:val="single" w:sz="1" w:space="0" w:color="BBBBBB"/>
+              <w:right w:val="single" w:sz="1" w:space="0" w:color="BBBBBB"/>
+            </w:tcBorders>
+            <w:tcMar>
+              <w:top w:w="60" w:type="dxa"/>
+              <w:left w:w="100" w:type="dxa"/>
+              <w:bottom w:w="60" w:type="dxa"/>
+              <w:right w:w="100" w:type="dxa"/>
+            </w:tcMar>
+          </w:tcPr>
+          <w:p>
+            <w:r>
+              <w:rPr>
+                <w:sz w:val="20"/>
+                <w:szCs w:val="20"/>
+              </w:rPr>
+              <w:t>Mathematics</w:t>
+            </w:r>
+          </w:p>
+        </w:tc>
+        <w:tc>
+          <w:tcPr>
+            <w:tcW w:w="1300" w:type="dxa"/>
+            <w:tcBorders>
+              <w:top w:val="single" w:sz="1" w:space="0" w:color="BBBBBB"/>
+              <w:left w:val="single" w:sz="1" w:space="0" w:color="BBBBBB"/>
+              <w:bottom w:val="single" w:sz="1" w:space="0" w:color="BBBBBB"/>
+              <w:right w:val="single" w:sz="1" w:space="0" w:color="BBBBBB"/>
+            </w:tcBorders>
+            <w:tcMar>
+              <w:top w:w="60" w:type="dxa"/>
+              <w:left w:w="100" w:type="dxa"/>
+              <w:bottom w:w="60" w:type="dxa"/>
+              <w:right w:w="100" w:type="dxa"/>
+            </w:tcMar>
+          </w:tcPr>
+          <w:p>
+            <w:r>
+              <w:rPr>
+                <w:sz w:val="20"/>
+                <w:szCs w:val="20"/>
+              </w:rPr>
+              <w:t>8–12</w:t>
+            </w:r>
+          </w:p>
+        </w:tc>
+        <w:tc>
+          <w:tcPr>
+            <w:tcW w:w="1300" w:type="dxa"/>
+            <w:tcBorders>
+              <w:top w:val="single" w:sz="1" w:space="0" w:color="BBBBBB"/>
+              <w:left w:val="single" w:sz="1" w:space="0" w:color="BBBBBB"/>
+              <w:bottom w:val="single" w:sz="1" w:space="0" w:color="BBBBBB"/>
+              <w:right w:val="single" w:sz="1" w:space="0" w:color="BBBBBB"/>
+            </w:tcBorders>
+            <w:tcMar>
+              <w:top w:w="60" w:type="dxa"/>
+              <w:left w:w="100" w:type="dxa"/>
+              <w:bottom w:w="60" w:type="dxa"/>
+              <w:right w:w="100" w:type="dxa"/>
+            </w:tcMar>
+          </w:tcPr>
+          <w:p>
+            <w:r>
+              <w:rPr>
+                <w:sz w:val="20"/>
+                <w:szCs w:val="20"/>
+              </w:rPr>
+              <w:t>81</w:t>
+            </w:r>
+          </w:p>
+        </w:tc>
+        <w:tc>
+          <w:tcPr>
+            <w:tcW w:w="1300" w:type="dxa"/>
+            <w:tcBorders>
+              <w:top w:val="single" w:sz="1" w:space="0" w:color="BBBBBB"/>
+              <w:left w:val="single" w:sz="1" w:space="0" w:color="BBBBBB"/>
+              <w:bottom w:val="single" w:sz="1" w:space="0" w:color="BBBBBB"/>
+              <w:right w:val="single" w:sz="1" w:space="0" w:color="BBBBBB"/>
+            </w:tcBorders>
+            <w:tcMar>
+              <w:top w:w="60" w:type="dxa"/>
+              <w:left w:w="100" w:type="dxa"/>
+              <w:bottom w:w="60" w:type="dxa"/>
+              <w:right w:w="100" w:type="dxa"/>
+            </w:tcMar>
+          </w:tcPr>
+          <w:p>
+            <w:r>
+              <w:rPr>
+                <w:sz w:val="20"/>
+                <w:szCs w:val="20"/>
+              </w:rPr>
+              <w:t>4,003</w:t>
+            </w:r>
+          </w:p>
+        </w:tc>
+        <w:tc>
+          <w:tcPr>
+            <w:tcW w:w="1300" w:type="dxa"/>
+            <w:tcBorders>
+              <w:top w:val="single" w:sz="1" w:space="0" w:color="BBBBBB"/>
+              <w:left w:val="single" w:sz="1" w:space="0" w:color="BBBBBB"/>
+              <w:bottom w:val="single" w:sz="1" w:space="0" w:color="BBBBBB"/>
+              <w:right w:val="single" w:sz="1" w:space="0" w:color="BBBBBB"/>
+            </w:tcBorders>
+            <w:tcMar>
+              <w:top w:w="60" w:type="dxa"/>
+              <w:left w:w="100" w:type="dxa"/>
+              <w:bottom w:w="60" w:type="dxa"/>
+              <w:right w:w="100" w:type="dxa"/>
+            </w:tcMar>
+          </w:tcPr>
+          <w:p>
+            <w:r>
+              <w:rPr>
+                <w:sz w:val="20"/>
+                <w:szCs w:val="20"/>
+              </w:rPr>
+              <w:t>~36,000</w:t>
+            </w:r>
+          </w:p>
+        </w:tc>
+        <w:tc>
+          <w:tcPr>
+            <w:tcW w:w="1300" w:type="dxa"/>
+            <w:tcBorders>
+              <w:top w:val="single" w:sz="1" w:space="0" w:color="BBBBBB"/>
+              <w:left w:val="single" w:sz="1" w:space="0" w:color="BBBBBB"/>
+              <w:bottom w:val="single" w:sz="1" w:space="0" w:color="BBBBBB"/>
+              <w:right w:val="single" w:sz="1" w:space="0" w:color="BBBBBB"/>
+            </w:tcBorders>
+            <w:tcMar>
+              <w:top w:w="60" w:type="dxa"/>
+              <w:left w:w="100" w:type="dxa"/>
+              <w:bottom w:w="60" w:type="dxa"/>
+              <w:right w:w="100" w:type="dxa"/>
+            </w:tcMar>
+          </w:tcPr>
+          <w:p>
+            <w:r>
+              <w:rPr>
+                <w:sz w:val="20"/>
+                <w:szCs w:val="20"/>
+              </w:rPr>
+              <w:t>~9,000</w:t>
+            </w:r>
+          </w:p>
+        </w:tc>
+      </w:tr>
+      <w:tr>
+        <w:tc>
+          <w:tcPr>
+            <w:tcW w:w="1300" w:type="dxa"/>
+            <w:tcBorders>
+              <w:top w:val="single" w:sz="1" w:space="0" w:color="BBBBBB"/>
+              <w:left w:val="single" w:sz="1" w:space="0" w:color="BBBBBB"/>
+              <w:bottom w:val="single" w:sz="1" w:space="0" w:color="BBBBBB"/>
+              <w:right w:val="single" w:sz="1" w:space="0" w:color="BBBBBB"/>
+            </w:tcBorders>
+            <w:tcMar>
+              <w:top w:w="60" w:type="dxa"/>
+              <w:left w:w="100" w:type="dxa"/>
+              <w:bottom w:w="60" w:type="dxa"/>
+              <w:right w:w="100" w:type="dxa"/>
+            </w:tcMar>
+          </w:tcPr>
+          <w:p>
+            <w:r>
+              <w:rPr>
+                <w:sz w:val="20"/>
+                <w:szCs w:val="20"/>
+              </w:rPr>
+              <w:t>Science</w:t>
+            </w:r>
+          </w:p>
+        </w:tc>
+        <w:tc>
+          <w:tcPr>
+            <w:tcW w:w="1300" w:type="dxa"/>
+            <w:tcBorders>
+              <w:top w:val="single" w:sz="1" w:space="0" w:color="BBBBBB"/>
+              <w:left w:val="single" w:sz="1" w:space="0" w:color="BBBBBB"/>
+              <w:bottom w:val="single" w:sz="1" w:space="0" w:color="BBBBBB"/>
+              <w:right w:val="single" w:sz="1" w:space="0" w:color="BBBBBB"/>
+            </w:tcBorders>
+            <w:tcMar>
+              <w:top w:w="60" w:type="dxa"/>
+              <w:left w:w="100" w:type="dxa"/>
+              <w:bottom w:w="60" w:type="dxa"/>
+              <w:right w:w="100" w:type="dxa"/>
+            </w:tcMar>
+          </w:tcPr>
+          <w:p>
+            <w:r>
+              <w:rPr>
+                <w:sz w:val="20"/>
+                <w:szCs w:val="20"/>
+              </w:rPr>
+              <w:t>7–12</w:t>
+            </w:r>
+          </w:p>
+        </w:tc>
+        <w:tc>
+          <w:tcPr>
+            <w:tcW w:w="1300" w:type="dxa"/>
+            <w:tcBorders>
+              <w:top w:val="single" w:sz="1" w:space="0" w:color="BBBBBB"/>
+              <w:left w:val="single" w:sz="1" w:space="0" w:color="BBBBBB"/>
+              <w:bottom w:val="single" w:sz="1" w:space="0" w:color="BBBBBB"/>
+              <w:right w:val="single" w:sz="1" w:space="0" w:color="BBBBBB"/>
+            </w:tcBorders>
+            <w:tcMar>
+              <w:top w:w="60" w:type="dxa"/>
+              <w:left w:w="100" w:type="dxa"/>
+              <w:bottom w:w="60" w:type="dxa"/>
+              <w:right w:w="100" w:type="dxa"/>
+            </w:tcMar>
+          </w:tcPr>
+          <w:p>
+            <w:r>
+              <w:rPr>
+                <w:sz w:val="20"/>
+                <w:szCs w:val="20"/>
+              </w:rPr>
+              <w:t>138</w:t>
+            </w:r>
+          </w:p>
+        </w:tc>
+        <w:tc>
+          <w:tcPr>
+            <w:tcW w:w="1300" w:type="dxa"/>
+            <w:tcBorders>
+              <w:top w:val="single" w:sz="1" w:space="0" w:color="BBBBBB"/>
+              <w:left w:val="single" w:sz="1" w:space="0" w:color="BBBBBB"/>
+              <w:bottom w:val="single" w:sz="1" w:space="0" w:color="BBBBBB"/>
+              <w:right w:val="single" w:sz="1" w:space="0" w:color="BBBBBB"/>
+            </w:tcBorders>
+            <w:tcMar>
+              <w:top w:w="60" w:type="dxa"/>
+              <w:left w:w="100" w:type="dxa"/>
+              <w:bottom w:w="60" w:type="dxa"/>
+              <w:right w:w="100" w:type="dxa"/>
+            </w:tcMar>
+          </w:tcPr>
+          <w:p>
+            <w:r>
+              <w:rPr>
+                <w:sz w:val="20"/>
+                <w:szCs w:val="20"/>
+              </w:rPr>
+              <w:t>2,511</w:t>
+            </w:r>
+          </w:p>
+        </w:tc>
+        <w:tc>
+          <w:tcPr>
+            <w:tcW w:w="1300" w:type="dxa"/>
+            <w:tcBorders>
+              <w:top w:val="single" w:sz="1" w:space="0" w:color="BBBBBB"/>
+              <w:left w:val="single" w:sz="1" w:space="0" w:color="BBBBBB"/>
+              <w:bottom w:val="single" w:sz="1" w:space="0" w:color="BBBBBB"/>
+              <w:right w:val="single" w:sz="1" w:space="0" w:color="BBBBBB"/>
+            </w:tcBorders>
+            <w:tcMar>
+              <w:top w:w="60" w:type="dxa"/>
+              <w:left w:w="100" w:type="dxa"/>
+              <w:bottom w:w="60" w:type="dxa"/>
+              <w:right w:w="100" w:type="dxa"/>
+            </w:tcMar>
+          </w:tcPr>
+          <w:p>
+            <w:r>
+              <w:rPr>
+                <w:sz w:val="20"/>
+                <w:szCs w:val="20"/>
+              </w:rPr>
+              <w:t>~32,000</w:t>
+            </w:r>
+          </w:p>
+        </w:tc>
+        <w:tc>
+          <w:tcPr>
+            <w:tcW w:w="1300" w:type="dxa"/>
+            <w:tcBorders>
+              <w:top w:val="single" w:sz="1" w:space="0" w:color="BBBBBB"/>
+              <w:left w:val="single" w:sz="1" w:space="0" w:color="BBBBBB"/>
+              <w:bottom w:val="single" w:sz="1" w:space="0" w:color="BBBBBB"/>
+              <w:right w:val="single" w:sz="1" w:space="0" w:color="BBBBBB"/>
+            </w:tcBorders>
+            <w:tcMar>
+              <w:top w:w="60" w:type="dxa"/>
+              <w:left w:w="100" w:type="dxa"/>
+              <w:bottom w:w="60" w:type="dxa"/>
+              <w:right w:w="100" w:type="dxa"/>
+            </w:tcMar>
+          </w:tcPr>
+          <w:p>
+            <w:r>
+              <w:rPr>
+                <w:sz w:val="20"/>
+                <w:szCs w:val="20"/>
+              </w:rPr>
+              <w:t>~8,000</w:t>
+            </w:r>
+          </w:p>
+        </w:tc>
+      </w:tr>
+      <w:tr>
+        <w:tc>
+          <w:tcPr>
+            <w:tcW w:w="1300" w:type="dxa"/>
+            <w:tcBorders>
+              <w:top w:val="single" w:sz="1" w:space="0" w:color="BBBBBB"/>
+              <w:left w:val="single" w:sz="1" w:space="0" w:color="BBBBBB"/>
+              <w:bottom w:val="single" w:sz="1" w:space="0" w:color="BBBBBB"/>
+              <w:right w:val="single" w:sz="1" w:space="0" w:color="BBBBBB"/>
+            </w:tcBorders>
+            <w:tcMar>
+              <w:top w:w="60" w:type="dxa"/>
+              <w:left w:w="100" w:type="dxa"/>
+              <w:bottom w:w="60" w:type="dxa"/>
+              <w:right w:w="100" w:type="dxa"/>
+            </w:tcMar>
+          </w:tcPr>
+          <w:p>
+            <w:r>
+              <w:rPr>
+                <w:sz w:val="20"/>
+                <w:szCs w:val="20"/>
+              </w:rPr>
+              <w:t>Social Science</w:t>
+            </w:r>
+          </w:p>
+        </w:tc>
+        <w:tc>
+          <w:tcPr>
+            <w:tcW w:w="1300" w:type="dxa"/>
+            <w:tcBorders>
+              <w:top w:val="single" w:sz="1" w:space="0" w:color="BBBBBB"/>
+              <w:left w:val="single" w:sz="1" w:space="0" w:color="BBBBBB"/>
+              <w:bottom w:val="single" w:sz="1" w:space="0" w:color="BBBBBB"/>
+              <w:right w:val="single" w:sz="1" w:space="0" w:color="BBBBBB"/>
+            </w:tcBorders>
+            <w:tcMar>
+              <w:top w:w="60" w:type="dxa"/>
+              <w:left w:w="100" w:type="dxa"/>
+              <w:bottom w:w="60" w:type="dxa"/>
+              <w:right w:w="100" w:type="dxa"/>
+            </w:tcMar>
+          </w:tcPr>
+          <w:p>
+            <w:r>
+              <w:rPr>
+                <w:sz w:val="20"/>
+                <w:szCs w:val="20"/>
+              </w:rPr>
+              <w:t>7–12</w:t>
+            </w:r>
+          </w:p>
+        </w:tc>
+        <w:tc>
+          <w:tcPr>
+            <w:tcW w:w="1300" w:type="dxa"/>
+            <w:tcBorders>
+              <w:top w:val="single" w:sz="1" w:space="0" w:color="BBBBBB"/>
+              <w:left w:val="single" w:sz="1" w:space="0" w:color="BBBBBB"/>
+              <w:bottom w:val="single" w:sz="1" w:space="0" w:color="BBBBBB"/>
+              <w:right w:val="single" w:sz="1" w:space="0" w:color="BBBBBB"/>
+            </w:tcBorders>
+            <w:tcMar>
+              <w:top w:w="60" w:type="dxa"/>
+              <w:left w:w="100" w:type="dxa"/>
+              <w:bottom w:w="60" w:type="dxa"/>
+              <w:right w:w="100" w:type="dxa"/>
+            </w:tcMar>
+          </w:tcPr>
+          <w:p>
+            <w:r>
+              <w:rPr>
+                <w:sz w:val="20"/>
+                <w:szCs w:val="20"/>
+              </w:rPr>
+              <w:t>159</w:t>
+            </w:r>
+          </w:p>
+        </w:tc>
+        <w:tc>
+          <w:tcPr>
+            <w:tcW w:w="1300" w:type="dxa"/>
+            <w:tcBorders>
+              <w:top w:val="single" w:sz="1" w:space="0" w:color="BBBBBB"/>
+              <w:left w:val="single" w:sz="1" w:space="0" w:color="BBBBBB"/>
+              <w:bottom w:val="single" w:sz="1" w:space="0" w:color="BBBBBB"/>
+              <w:right w:val="single" w:sz="1" w:space="0" w:color="BBBBBB"/>
+            </w:tcBorders>
+            <w:tcMar>
+              <w:top w:w="60" w:type="dxa"/>
+              <w:left w:w="100" w:type="dxa"/>
+              <w:bottom w:w="60" w:type="dxa"/>
+              <w:right w:w="100" w:type="dxa"/>
+            </w:tcMar>
+          </w:tcPr>
+          <w:p>
+            <w:r>
+              <w:rPr>
+                <w:sz w:val="20"/>
+                <w:szCs w:val="20"/>
+              </w:rPr>
+              <w:t>2,147</w:t>
+            </w:r>
+          </w:p>
+        </w:tc>
+        <w:tc>
+          <w:tcPr>
+            <w:tcW w:w="1300" w:type="dxa"/>
+            <w:tcBorders>
+              <w:top w:val="single" w:sz="1" w:space="0" w:color="BBBBBB"/>
+              <w:left w:val="single" w:sz="1" w:space="0" w:color="BBBBBB"/>
+              <w:bottom w:val="single" w:sz="1" w:space="0" w:color="BBBBBB"/>
+              <w:right w:val="single" w:sz="1" w:space="0" w:color="BBBBBB"/>
+            </w:tcBorders>
+            <w:tcMar>
+              <w:top w:w="60" w:type="dxa"/>
+              <w:left w:w="100" w:type="dxa"/>
+              <w:bottom w:w="60" w:type="dxa"/>
+              <w:right w:w="100" w:type="dxa"/>
+            </w:tcMar>
+          </w:tcPr>
+          <w:p>
+            <w:r>
+              <w:rPr>
+                <w:sz w:val="20"/>
+                <w:szCs w:val="20"/>
+              </w:rPr>
+              <w:t>~33,000</w:t>
+            </w:r>
+          </w:p>
+        </w:tc>
+        <w:tc>
+          <w:tcPr>
+            <w:tcW w:w="1300" w:type="dxa"/>
+            <w:tcBorders>
+              <w:top w:val="single" w:sz="1" w:space="0" w:color="BBBBBB"/>
+              <w:left w:val="single" w:sz="1" w:space="0" w:color="BBBBBB"/>
+              <w:bottom w:val="single" w:sz="1" w:space="0" w:color="BBBBBB"/>
+              <w:right w:val="single" w:sz="1" w:space="0" w:color="BBBBBB"/>
+            </w:tcBorders>
+            <w:tcMar>
+              <w:top w:w="60" w:type="dxa"/>
+              <w:left w:w="100" w:type="dxa"/>
+              <w:bottom w:w="60" w:type="dxa"/>
+              <w:right w:w="100" w:type="dxa"/>
+            </w:tcMar>
+          </w:tcPr>
+          <w:p>
+            <w:r>
+              <w:rPr>
+                <w:sz w:val="20"/>
+                <w:szCs w:val="20"/>
+              </w:rPr>
+              <w:t>~8,300</w:t>
+            </w:r>
+          </w:p>
+        </w:tc>
+      </w:tr>
+      <w:tr>
+        <w:tc>
+          <w:tcPr>
+            <w:tcW w:w="1300" w:type="dxa"/>
+            <w:tcBorders>
+              <w:top w:val="single" w:sz="1" w:space="0" w:color="BBBBBB"/>
+              <w:left w:val="single" w:sz="1" w:space="0" w:color="BBBBBB"/>
+              <w:bottom w:val="single" w:sz="1" w:space="0" w:color="BBBBBB"/>
+              <w:right w:val="single" w:sz="1" w:space="0" w:color="BBBBBB"/>
+            </w:tcBorders>
             <w:tcMar>
               <w:top w:w="60" w:type="dxa"/>
               <w:left w:w="100" w:type="dxa"/>
@@ -1195,521 +1697,6 @@
                 <w:sz w:val="20"/>
                 <w:szCs w:val="20"/>
               </w:rPr>
-              <w:t>Avg tokens/</w:t>
-            </w:r>
-            <w:proofErr w:type="spellStart"/>
-            <w:r>
-              <w:rPr>
-                <w:b/>
-                <w:bCs/>
-                <w:sz w:val="20"/>
-                <w:szCs w:val="20"/>
-              </w:rPr>
-              <w:t>ch.</w:t>
-            </w:r>
-            <w:proofErr w:type="spellEnd"/>
-          </w:p>
-        </w:tc>
-      </w:tr>
-      <w:tr>
-        <w:tc>
-          <w:tcPr>
-            <w:tcW w:w="1300" w:type="dxa"/>
-            <w:tcBorders>
-              <w:top w:val="single" w:sz="1" w:space="0" w:color="BBBBBB"/>
-              <w:left w:val="single" w:sz="1" w:space="0" w:color="BBBBBB"/>
-              <w:bottom w:val="single" w:sz="1" w:space="0" w:color="BBBBBB"/>
-              <w:right w:val="single" w:sz="1" w:space="0" w:color="BBBBBB"/>
-            </w:tcBorders>
-            <w:tcMar>
-              <w:top w:w="60" w:type="dxa"/>
-              <w:left w:w="100" w:type="dxa"/>
-              <w:bottom w:w="60" w:type="dxa"/>
-              <w:right w:w="100" w:type="dxa"/>
-            </w:tcMar>
-          </w:tcPr>
-          <w:p>
-            <w:r>
-              <w:rPr>
-                <w:sz w:val="20"/>
-                <w:szCs w:val="20"/>
-              </w:rPr>
-              <w:t>Mathematics</w:t>
-            </w:r>
-          </w:p>
-        </w:tc>
-        <w:tc>
-          <w:tcPr>
-            <w:tcW w:w="1300" w:type="dxa"/>
-            <w:tcBorders>
-              <w:top w:val="single" w:sz="1" w:space="0" w:color="BBBBBB"/>
-              <w:left w:val="single" w:sz="1" w:space="0" w:color="BBBBBB"/>
-              <w:bottom w:val="single" w:sz="1" w:space="0" w:color="BBBBBB"/>
-              <w:right w:val="single" w:sz="1" w:space="0" w:color="BBBBBB"/>
-            </w:tcBorders>
-            <w:tcMar>
-              <w:top w:w="60" w:type="dxa"/>
-              <w:left w:w="100" w:type="dxa"/>
-              <w:bottom w:w="60" w:type="dxa"/>
-              <w:right w:w="100" w:type="dxa"/>
-            </w:tcMar>
-          </w:tcPr>
-          <w:p>
-            <w:r>
-              <w:rPr>
-                <w:sz w:val="20"/>
-                <w:szCs w:val="20"/>
-              </w:rPr>
-              <w:t>8–12</w:t>
-            </w:r>
-          </w:p>
-        </w:tc>
-        <w:tc>
-          <w:tcPr>
-            <w:tcW w:w="1300" w:type="dxa"/>
-            <w:tcBorders>
-              <w:top w:val="single" w:sz="1" w:space="0" w:color="BBBBBB"/>
-              <w:left w:val="single" w:sz="1" w:space="0" w:color="BBBBBB"/>
-              <w:bottom w:val="single" w:sz="1" w:space="0" w:color="BBBBBB"/>
-              <w:right w:val="single" w:sz="1" w:space="0" w:color="BBBBBB"/>
-            </w:tcBorders>
-            <w:tcMar>
-              <w:top w:w="60" w:type="dxa"/>
-              <w:left w:w="100" w:type="dxa"/>
-              <w:bottom w:w="60" w:type="dxa"/>
-              <w:right w:w="100" w:type="dxa"/>
-            </w:tcMar>
-          </w:tcPr>
-          <w:p>
-            <w:r>
-              <w:rPr>
-                <w:sz w:val="20"/>
-                <w:szCs w:val="20"/>
-              </w:rPr>
-              <w:t>81</w:t>
-            </w:r>
-          </w:p>
-        </w:tc>
-        <w:tc>
-          <w:tcPr>
-            <w:tcW w:w="1300" w:type="dxa"/>
-            <w:tcBorders>
-              <w:top w:val="single" w:sz="1" w:space="0" w:color="BBBBBB"/>
-              <w:left w:val="single" w:sz="1" w:space="0" w:color="BBBBBB"/>
-              <w:bottom w:val="single" w:sz="1" w:space="0" w:color="BBBBBB"/>
-              <w:right w:val="single" w:sz="1" w:space="0" w:color="BBBBBB"/>
-            </w:tcBorders>
-            <w:tcMar>
-              <w:top w:w="60" w:type="dxa"/>
-              <w:left w:w="100" w:type="dxa"/>
-              <w:bottom w:w="60" w:type="dxa"/>
-              <w:right w:w="100" w:type="dxa"/>
-            </w:tcMar>
-          </w:tcPr>
-          <w:p>
-            <w:r>
-              <w:rPr>
-                <w:sz w:val="20"/>
-                <w:szCs w:val="20"/>
-              </w:rPr>
-              <w:t>4,003</w:t>
-            </w:r>
-          </w:p>
-        </w:tc>
-        <w:tc>
-          <w:tcPr>
-            <w:tcW w:w="1300" w:type="dxa"/>
-            <w:tcBorders>
-              <w:top w:val="single" w:sz="1" w:space="0" w:color="BBBBBB"/>
-              <w:left w:val="single" w:sz="1" w:space="0" w:color="BBBBBB"/>
-              <w:bottom w:val="single" w:sz="1" w:space="0" w:color="BBBBBB"/>
-              <w:right w:val="single" w:sz="1" w:space="0" w:color="BBBBBB"/>
-            </w:tcBorders>
-            <w:tcMar>
-              <w:top w:w="60" w:type="dxa"/>
-              <w:left w:w="100" w:type="dxa"/>
-              <w:bottom w:w="60" w:type="dxa"/>
-              <w:right w:w="100" w:type="dxa"/>
-            </w:tcMar>
-          </w:tcPr>
-          <w:p>
-            <w:r>
-              <w:rPr>
-                <w:sz w:val="20"/>
-                <w:szCs w:val="20"/>
-              </w:rPr>
-              <w:t>~36,000</w:t>
-            </w:r>
-          </w:p>
-        </w:tc>
-        <w:tc>
-          <w:tcPr>
-            <w:tcW w:w="1300" w:type="dxa"/>
-            <w:tcBorders>
-              <w:top w:val="single" w:sz="1" w:space="0" w:color="BBBBBB"/>
-              <w:left w:val="single" w:sz="1" w:space="0" w:color="BBBBBB"/>
-              <w:bottom w:val="single" w:sz="1" w:space="0" w:color="BBBBBB"/>
-              <w:right w:val="single" w:sz="1" w:space="0" w:color="BBBBBB"/>
-            </w:tcBorders>
-            <w:tcMar>
-              <w:top w:w="60" w:type="dxa"/>
-              <w:left w:w="100" w:type="dxa"/>
-              <w:bottom w:w="60" w:type="dxa"/>
-              <w:right w:w="100" w:type="dxa"/>
-            </w:tcMar>
-          </w:tcPr>
-          <w:p>
-            <w:r>
-              <w:rPr>
-                <w:sz w:val="20"/>
-                <w:szCs w:val="20"/>
-              </w:rPr>
-              <w:t>~9,000</w:t>
-            </w:r>
-          </w:p>
-        </w:tc>
-      </w:tr>
-      <w:tr>
-        <w:tc>
-          <w:tcPr>
-            <w:tcW w:w="1300" w:type="dxa"/>
-            <w:tcBorders>
-              <w:top w:val="single" w:sz="1" w:space="0" w:color="BBBBBB"/>
-              <w:left w:val="single" w:sz="1" w:space="0" w:color="BBBBBB"/>
-              <w:bottom w:val="single" w:sz="1" w:space="0" w:color="BBBBBB"/>
-              <w:right w:val="single" w:sz="1" w:space="0" w:color="BBBBBB"/>
-            </w:tcBorders>
-            <w:tcMar>
-              <w:top w:w="60" w:type="dxa"/>
-              <w:left w:w="100" w:type="dxa"/>
-              <w:bottom w:w="60" w:type="dxa"/>
-              <w:right w:w="100" w:type="dxa"/>
-            </w:tcMar>
-          </w:tcPr>
-          <w:p>
-            <w:r>
-              <w:rPr>
-                <w:sz w:val="20"/>
-                <w:szCs w:val="20"/>
-              </w:rPr>
-              <w:t>Science</w:t>
-            </w:r>
-          </w:p>
-        </w:tc>
-        <w:tc>
-          <w:tcPr>
-            <w:tcW w:w="1300" w:type="dxa"/>
-            <w:tcBorders>
-              <w:top w:val="single" w:sz="1" w:space="0" w:color="BBBBBB"/>
-              <w:left w:val="single" w:sz="1" w:space="0" w:color="BBBBBB"/>
-              <w:bottom w:val="single" w:sz="1" w:space="0" w:color="BBBBBB"/>
-              <w:right w:val="single" w:sz="1" w:space="0" w:color="BBBBBB"/>
-            </w:tcBorders>
-            <w:tcMar>
-              <w:top w:w="60" w:type="dxa"/>
-              <w:left w:w="100" w:type="dxa"/>
-              <w:bottom w:w="60" w:type="dxa"/>
-              <w:right w:w="100" w:type="dxa"/>
-            </w:tcMar>
-          </w:tcPr>
-          <w:p>
-            <w:r>
-              <w:rPr>
-                <w:sz w:val="20"/>
-                <w:szCs w:val="20"/>
-              </w:rPr>
-              <w:t>7–12</w:t>
-            </w:r>
-          </w:p>
-        </w:tc>
-        <w:tc>
-          <w:tcPr>
-            <w:tcW w:w="1300" w:type="dxa"/>
-            <w:tcBorders>
-              <w:top w:val="single" w:sz="1" w:space="0" w:color="BBBBBB"/>
-              <w:left w:val="single" w:sz="1" w:space="0" w:color="BBBBBB"/>
-              <w:bottom w:val="single" w:sz="1" w:space="0" w:color="BBBBBB"/>
-              <w:right w:val="single" w:sz="1" w:space="0" w:color="BBBBBB"/>
-            </w:tcBorders>
-            <w:tcMar>
-              <w:top w:w="60" w:type="dxa"/>
-              <w:left w:w="100" w:type="dxa"/>
-              <w:bottom w:w="60" w:type="dxa"/>
-              <w:right w:w="100" w:type="dxa"/>
-            </w:tcMar>
-          </w:tcPr>
-          <w:p>
-            <w:r>
-              <w:rPr>
-                <w:sz w:val="20"/>
-                <w:szCs w:val="20"/>
-              </w:rPr>
-              <w:t>138</w:t>
-            </w:r>
-          </w:p>
-        </w:tc>
-        <w:tc>
-          <w:tcPr>
-            <w:tcW w:w="1300" w:type="dxa"/>
-            <w:tcBorders>
-              <w:top w:val="single" w:sz="1" w:space="0" w:color="BBBBBB"/>
-              <w:left w:val="single" w:sz="1" w:space="0" w:color="BBBBBB"/>
-              <w:bottom w:val="single" w:sz="1" w:space="0" w:color="BBBBBB"/>
-              <w:right w:val="single" w:sz="1" w:space="0" w:color="BBBBBB"/>
-            </w:tcBorders>
-            <w:tcMar>
-              <w:top w:w="60" w:type="dxa"/>
-              <w:left w:w="100" w:type="dxa"/>
-              <w:bottom w:w="60" w:type="dxa"/>
-              <w:right w:w="100" w:type="dxa"/>
-            </w:tcMar>
-          </w:tcPr>
-          <w:p>
-            <w:r>
-              <w:rPr>
-                <w:sz w:val="20"/>
-                <w:szCs w:val="20"/>
-              </w:rPr>
-              <w:t>2,511</w:t>
-            </w:r>
-          </w:p>
-        </w:tc>
-        <w:tc>
-          <w:tcPr>
-            <w:tcW w:w="1300" w:type="dxa"/>
-            <w:tcBorders>
-              <w:top w:val="single" w:sz="1" w:space="0" w:color="BBBBBB"/>
-              <w:left w:val="single" w:sz="1" w:space="0" w:color="BBBBBB"/>
-              <w:bottom w:val="single" w:sz="1" w:space="0" w:color="BBBBBB"/>
-              <w:right w:val="single" w:sz="1" w:space="0" w:color="BBBBBB"/>
-            </w:tcBorders>
-            <w:tcMar>
-              <w:top w:w="60" w:type="dxa"/>
-              <w:left w:w="100" w:type="dxa"/>
-              <w:bottom w:w="60" w:type="dxa"/>
-              <w:right w:w="100" w:type="dxa"/>
-            </w:tcMar>
-          </w:tcPr>
-          <w:p>
-            <w:r>
-              <w:rPr>
-                <w:sz w:val="20"/>
-                <w:szCs w:val="20"/>
-              </w:rPr>
-              <w:t>~32,000</w:t>
-            </w:r>
-          </w:p>
-        </w:tc>
-        <w:tc>
-          <w:tcPr>
-            <w:tcW w:w="1300" w:type="dxa"/>
-            <w:tcBorders>
-              <w:top w:val="single" w:sz="1" w:space="0" w:color="BBBBBB"/>
-              <w:left w:val="single" w:sz="1" w:space="0" w:color="BBBBBB"/>
-              <w:bottom w:val="single" w:sz="1" w:space="0" w:color="BBBBBB"/>
-              <w:right w:val="single" w:sz="1" w:space="0" w:color="BBBBBB"/>
-            </w:tcBorders>
-            <w:tcMar>
-              <w:top w:w="60" w:type="dxa"/>
-              <w:left w:w="100" w:type="dxa"/>
-              <w:bottom w:w="60" w:type="dxa"/>
-              <w:right w:w="100" w:type="dxa"/>
-            </w:tcMar>
-          </w:tcPr>
-          <w:p>
-            <w:r>
-              <w:rPr>
-                <w:sz w:val="20"/>
-                <w:szCs w:val="20"/>
-              </w:rPr>
-              <w:t>~8,000</w:t>
-            </w:r>
-          </w:p>
-        </w:tc>
-      </w:tr>
-      <w:tr>
-        <w:tc>
-          <w:tcPr>
-            <w:tcW w:w="1300" w:type="dxa"/>
-            <w:tcBorders>
-              <w:top w:val="single" w:sz="1" w:space="0" w:color="BBBBBB"/>
-              <w:left w:val="single" w:sz="1" w:space="0" w:color="BBBBBB"/>
-              <w:bottom w:val="single" w:sz="1" w:space="0" w:color="BBBBBB"/>
-              <w:right w:val="single" w:sz="1" w:space="0" w:color="BBBBBB"/>
-            </w:tcBorders>
-            <w:tcMar>
-              <w:top w:w="60" w:type="dxa"/>
-              <w:left w:w="100" w:type="dxa"/>
-              <w:bottom w:w="60" w:type="dxa"/>
-              <w:right w:w="100" w:type="dxa"/>
-            </w:tcMar>
-          </w:tcPr>
-          <w:p>
-            <w:r>
-              <w:rPr>
-                <w:sz w:val="20"/>
-                <w:szCs w:val="20"/>
-              </w:rPr>
-              <w:t>Social Science</w:t>
-            </w:r>
-          </w:p>
-        </w:tc>
-        <w:tc>
-          <w:tcPr>
-            <w:tcW w:w="1300" w:type="dxa"/>
-            <w:tcBorders>
-              <w:top w:val="single" w:sz="1" w:space="0" w:color="BBBBBB"/>
-              <w:left w:val="single" w:sz="1" w:space="0" w:color="BBBBBB"/>
-              <w:bottom w:val="single" w:sz="1" w:space="0" w:color="BBBBBB"/>
-              <w:right w:val="single" w:sz="1" w:space="0" w:color="BBBBBB"/>
-            </w:tcBorders>
-            <w:tcMar>
-              <w:top w:w="60" w:type="dxa"/>
-              <w:left w:w="100" w:type="dxa"/>
-              <w:bottom w:w="60" w:type="dxa"/>
-              <w:right w:w="100" w:type="dxa"/>
-            </w:tcMar>
-          </w:tcPr>
-          <w:p>
-            <w:r>
-              <w:rPr>
-                <w:sz w:val="20"/>
-                <w:szCs w:val="20"/>
-              </w:rPr>
-              <w:t>7–12</w:t>
-            </w:r>
-          </w:p>
-        </w:tc>
-        <w:tc>
-          <w:tcPr>
-            <w:tcW w:w="1300" w:type="dxa"/>
-            <w:tcBorders>
-              <w:top w:val="single" w:sz="1" w:space="0" w:color="BBBBBB"/>
-              <w:left w:val="single" w:sz="1" w:space="0" w:color="BBBBBB"/>
-              <w:bottom w:val="single" w:sz="1" w:space="0" w:color="BBBBBB"/>
-              <w:right w:val="single" w:sz="1" w:space="0" w:color="BBBBBB"/>
-            </w:tcBorders>
-            <w:tcMar>
-              <w:top w:w="60" w:type="dxa"/>
-              <w:left w:w="100" w:type="dxa"/>
-              <w:bottom w:w="60" w:type="dxa"/>
-              <w:right w:w="100" w:type="dxa"/>
-            </w:tcMar>
-          </w:tcPr>
-          <w:p>
-            <w:r>
-              <w:rPr>
-                <w:sz w:val="20"/>
-                <w:szCs w:val="20"/>
-              </w:rPr>
-              <w:t>159</w:t>
-            </w:r>
-          </w:p>
-        </w:tc>
-        <w:tc>
-          <w:tcPr>
-            <w:tcW w:w="1300" w:type="dxa"/>
-            <w:tcBorders>
-              <w:top w:val="single" w:sz="1" w:space="0" w:color="BBBBBB"/>
-              <w:left w:val="single" w:sz="1" w:space="0" w:color="BBBBBB"/>
-              <w:bottom w:val="single" w:sz="1" w:space="0" w:color="BBBBBB"/>
-              <w:right w:val="single" w:sz="1" w:space="0" w:color="BBBBBB"/>
-            </w:tcBorders>
-            <w:tcMar>
-              <w:top w:w="60" w:type="dxa"/>
-              <w:left w:w="100" w:type="dxa"/>
-              <w:bottom w:w="60" w:type="dxa"/>
-              <w:right w:w="100" w:type="dxa"/>
-            </w:tcMar>
-          </w:tcPr>
-          <w:p>
-            <w:r>
-              <w:rPr>
-                <w:sz w:val="20"/>
-                <w:szCs w:val="20"/>
-              </w:rPr>
-              <w:t>2,147</w:t>
-            </w:r>
-          </w:p>
-        </w:tc>
-        <w:tc>
-          <w:tcPr>
-            <w:tcW w:w="1300" w:type="dxa"/>
-            <w:tcBorders>
-              <w:top w:val="single" w:sz="1" w:space="0" w:color="BBBBBB"/>
-              <w:left w:val="single" w:sz="1" w:space="0" w:color="BBBBBB"/>
-              <w:bottom w:val="single" w:sz="1" w:space="0" w:color="BBBBBB"/>
-              <w:right w:val="single" w:sz="1" w:space="0" w:color="BBBBBB"/>
-            </w:tcBorders>
-            <w:tcMar>
-              <w:top w:w="60" w:type="dxa"/>
-              <w:left w:w="100" w:type="dxa"/>
-              <w:bottom w:w="60" w:type="dxa"/>
-              <w:right w:w="100" w:type="dxa"/>
-            </w:tcMar>
-          </w:tcPr>
-          <w:p>
-            <w:r>
-              <w:rPr>
-                <w:sz w:val="20"/>
-                <w:szCs w:val="20"/>
-              </w:rPr>
-              <w:t>~33,000</w:t>
-            </w:r>
-          </w:p>
-        </w:tc>
-        <w:tc>
-          <w:tcPr>
-            <w:tcW w:w="1300" w:type="dxa"/>
-            <w:tcBorders>
-              <w:top w:val="single" w:sz="1" w:space="0" w:color="BBBBBB"/>
-              <w:left w:val="single" w:sz="1" w:space="0" w:color="BBBBBB"/>
-              <w:bottom w:val="single" w:sz="1" w:space="0" w:color="BBBBBB"/>
-              <w:right w:val="single" w:sz="1" w:space="0" w:color="BBBBBB"/>
-            </w:tcBorders>
-            <w:tcMar>
-              <w:top w:w="60" w:type="dxa"/>
-              <w:left w:w="100" w:type="dxa"/>
-              <w:bottom w:w="60" w:type="dxa"/>
-              <w:right w:w="100" w:type="dxa"/>
-            </w:tcMar>
-          </w:tcPr>
-          <w:p>
-            <w:r>
-              <w:rPr>
-                <w:sz w:val="20"/>
-                <w:szCs w:val="20"/>
-              </w:rPr>
-              <w:t>~8,300</w:t>
-            </w:r>
-          </w:p>
-        </w:tc>
-      </w:tr>
-      <w:tr>
-        <w:tc>
-          <w:tcPr>
-            <w:tcW w:w="1300" w:type="dxa"/>
-            <w:tcBorders>
-              <w:top w:val="single" w:sz="1" w:space="0" w:color="BBBBBB"/>
-              <w:left w:val="single" w:sz="1" w:space="0" w:color="BBBBBB"/>
-              <w:bottom w:val="single" w:sz="1" w:space="0" w:color="BBBBBB"/>
-              <w:right w:val="single" w:sz="1" w:space="0" w:color="BBBBBB"/>
-            </w:tcBorders>
-            <w:tcMar>
-              <w:top w:w="60" w:type="dxa"/>
-              <w:left w:w="100" w:type="dxa"/>
-              <w:bottom w:w="60" w:type="dxa"/>
-              <w:right w:w="100" w:type="dxa"/>
-            </w:tcMar>
-          </w:tcPr>
-          <w:p>
-            <w:r>
-              <w:rPr>
-                <w:b/>
-                <w:bCs/>
-                <w:sz w:val="20"/>
-                <w:szCs w:val="20"/>
-              </w:rPr>
               <w:t>Total</w:t>
             </w:r>
           </w:p>
@@ -1857,7 +1844,6 @@
         <w:pStyle w:val="Heading2"/>
       </w:pPr>
       <w:r>
-        <w:lastRenderedPageBreak/>
         <w:t>4.2 Baselines</w:t>
       </w:r>
     </w:p>
@@ -1928,6 +1914,7 @@
           <w:b/>
           <w:bCs/>
         </w:rPr>
+        <w:lastRenderedPageBreak/>
         <w:t xml:space="preserve">B4 — Semantic: </w:t>
       </w:r>
       <w:r>
@@ -1959,11 +1946,8 @@
       </w:r>
     </w:p>
     <w:p>
-      <w:pPr>
-        <w:pStyle w:val="Normal"/>
-      </w:pPr>
-      <w:r>
-        <w:t xml:space="preserve">B6 — Hybrid: Educational structural chunking combined with semantic sub-splitting. Each structurally detected unit is further split at cosine similarity breakpoints where coherence drops below the 85th percentile. This is the strongest single-strategy baseline. PACER uses Hybrid as its base chunking strategy and adds CAS-based reranking on top; consequently, PACER and Hybrid produce identical retrieval metric scores (P@1, P@5, MRR, nDCG@10) — differentiation between them is visible only through CAS scores.</w:t>
+      <w:r>
+        <w:t>B6 — Hybrid: Educational structural chunking combined with semantic sub-splitting. Each structurally detected unit is further split at cosine similarity breakpoints where coherence drops below the 85th percentile. This is the strongest single-strategy baseline. PACER uses Hybrid as its base chunking strategy and adds CAS-based reranking on top; consequently, PACER and Hybrid produce identical retrieval metric scores (P@1, P@5, MRR, nDCG@10) — differentiation between them is visible only through CAS scores.</w:t>
       </w:r>
     </w:p>
     <w:p>
@@ -2042,6 +2026,7 @@
         <w:jc w:val="both"/>
       </w:pPr>
       <w:r>
+        <w:lastRenderedPageBreak/>
         <w:t>We constructed a benchmark of 798 questions by prompting Llama-3.1-8B-Instruct via the Groq API, using NCERT textbook chunks as source context. Each question was generated with an explicit grade level (7–12), subject, and Bloom level as generation constraints, and labelled with the gold-standard chapter ID of its source chunk. The benchmark covers 134 unique chapters across all three subjects and six grade levels.</w:t>
       </w:r>
     </w:p>
@@ -2055,19 +2040,13 @@
       </w:r>
     </w:p>
     <w:p>
-      <w:pPr>
-        <w:pStyle w:val="Normal"/>
-      </w:pPr>
-      <w:r>
-        <w:t xml:space="preserve">An important caveat: all 798 benchmark questions were generated synthetically by Llama-3.1-8B-Instruct — the same model family used in the generation pipeline. This introduces potential evaluation bias: questions may be structurally simpler than real student queries, and chunks in the model's context during generation may receive inflated retrieval scores. This limitation is acknowledged in Section 6.4. A follow-up study with real CBSE student queries is planned.</w:t>
-      </w:r>
-    </w:p>
-    <w:p>
-      <w:pPr>
-        <w:pStyle w:val="Normal"/>
-      </w:pPr>
-      <w:r>
-        <w:t xml:space="preserve">An important caveat: all 798 benchmark questions were generated synthetically by Llama-3.1-8B-Instruct — the same model family used in the generation pipeline. This introduces a potential evaluation bias: questions may be structurally simpler than real student queries, and chunks in the model's context during generation may receive inflated retrieval scores. This limitation is acknowledged in Section 6.4. A follow-up study with real CBSE student queries is planned to validate retrieval quality on naturally occurring questions.</w:t>
+      <w:r>
+        <w:t>An important caveat: all 798 benchmark questions were generated synthetically by Llama-3.1-8B-Instruct — the same model family used in the generation pipeline. This introduces potential evaluation bias: questions may be structurally simpler than real student queries, and chunks in the model's context during generation may receive inflated retrieval scores. This limitation is acknowledged in Section 6.4. A follow-up study with real CBSE student queries is planned.</w:t>
+      </w:r>
+    </w:p>
+    <w:p>
+      <w:r>
+        <w:t>An important caveat: all 798 benchmark questions were generated synthetically by Llama-3.1-8B-Instruct — the same model family used in the generation pipeline. This introduces a potential evaluation bias: questions may be structurally simpler than real student queries, and chunks in the model's context during generation may receive inflated retrieval scores. This limitation is acknowledged in Section 6.4. A follow-up study with real CBSE student queries is planned to validate retrieval quality on naturally occurring questions.</w:t>
       </w:r>
     </w:p>
     <w:p>
@@ -2120,7 +2099,11 @@
         <w:jc w:val="both"/>
       </w:pPr>
       <w:r>
-        <w:t>Inter-judge agreement is computed using Fleiss’ κ (three-way) and Pearson r (pairwise). Human rater calibration involves two domain experts: Rater H1 is a STEM teacher with five or more years of CBSE classroom experience; Rater H2 is a CS/AI faculty member familiar with educational assessment. Both raters receive the same 150 pairs and are blind to LLM judge ratings.</w:t>
+        <w:t xml:space="preserve">Inter-judge agreement is computed using Fleiss’ κ (three-way) and Pearson r (pairwise). Human rater calibration involves two domain experts: Rater H1 is a STEM teacher with five </w:t>
+      </w:r>
+      <w:r>
+        <w:lastRenderedPageBreak/>
+        <w:t>or more years of CBSE classroom experience; Rater H2 is a CS/AI faculty member familiar with educational assessment. Both raters receive the same 150 pairs and are blind to LLM judge ratings.</w:t>
       </w:r>
     </w:p>
     <w:p>
@@ -2410,7 +2393,6 @@
                 <w:sz w:val="20"/>
                 <w:szCs w:val="20"/>
               </w:rPr>
-              <w:lastRenderedPageBreak/>
               <w:t>Fixed-256</w:t>
             </w:r>
           </w:p>
@@ -3712,11 +3694,8 @@
       </w:r>
     </w:p>
     <w:p>
-      <w:pPr>
-        <w:pStyle w:val="Normal"/>
-      </w:pPr>
-      <w:r>
-        <w:t xml:space="preserve">An important clarification regarding Table 2: PACER and Hybrid produce identical retrieval metric scores because PACER uses Hybrid as its base chunking strategy and adds the CAS reranker on top. The reranking step does not change which chunks exist in the index — it changes which chunks surface first based on curriculum appropriateness. The advantage of PACER over Hybrid is therefore not measurable by P@k or nDCG and is captured entirely by CAS (Table 4). Researchers optimising for P@k alone will find no advantage in PACER over Hybrid; those deploying in educational settings where grade-level appropriateness and prerequisite alignment matter will find CAS reranking essential.</w:t>
+      <w:r>
+        <w:t>An important clarification regarding Table 2: PACER and Hybrid produce identical retrieval metric scores because PACER uses Hybrid as its base chunking strategy and adds the CAS reranker on top. The reranking step does not change which chunks exist in the index — it changes which chunks surface first based on curriculum appropriateness. The advantage of PACER over Hybrid is therefore not measurable by P@k or nDCG and is captured entirely by CAS (Table 4). Researchers optimising for P@k alone will find no advantage in PACER over Hybrid; those deploying in educational settings where grade-level appropriateness and prerequisite alignment matter will find CAS reranking essential.</w:t>
       </w:r>
     </w:p>
     <w:p>
@@ -3728,6 +3707,7 @@
         <w:rPr>
           <w:noProof/>
         </w:rPr>
+        <w:lastRenderedPageBreak/>
         <w:drawing>
           <wp:inline distT="0" distB="0" distL="0" distR="0" wp14:anchorId="3063DAFB" wp14:editId="6039FDB1">
             <wp:extent cx="5104563" cy="2333983"/>
@@ -3832,7 +3812,6 @@
         <w:rPr>
           <w:noProof/>
         </w:rPr>
-        <w:lastRenderedPageBreak/>
         <w:drawing>
           <wp:inline distT="0" distB="0" distL="0" distR="0" wp14:anchorId="0DFF647A" wp14:editId="19BE4934">
             <wp:extent cx="5235191" cy="2331649"/>
@@ -3885,6 +3864,7 @@
         <w:rPr>
           <w:noProof/>
         </w:rPr>
+        <w:lastRenderedPageBreak/>
         <w:drawing>
           <wp:inline distT="0" distB="0" distL="0" distR="0" wp14:anchorId="49075EBB" wp14:editId="64B8F913">
             <wp:extent cx="5731510" cy="2575560"/>
@@ -4054,7 +4034,6 @@
         <w:pStyle w:val="Heading2"/>
       </w:pPr>
       <w:r>
-        <w:lastRenderedPageBreak/>
         <w:t>5.2 Ablation studies</w:t>
       </w:r>
     </w:p>
@@ -4917,6 +4896,7 @@
         <w:jc w:val="both"/>
       </w:pPr>
       <w:r>
+        <w:lastRenderedPageBreak/>
         <w:t>The ablation results surface three findings. Removing the boundary detector (A2: No Boundary) raises P@1 from 0.793 to 0.826 and nDCG@10 from 0.907 to 0.922. On standard metrics this looks like an improvement. But boundary-preserving chunks are longer and carry structural preamble — definition headers, example labels — that reduces cosine similarity with short factoid queries even while delivering more complete pedagogical context. CAS catches the regression that P@k misses (see Section 5.4).</w:t>
       </w:r>
     </w:p>
@@ -9003,15 +8983,16 @@
         <w:jc w:val="both"/>
       </w:pPr>
       <w:r>
-        <w:t>The ablation results make the limitation of standard metrics concrete. Removing the boundary detector (A2: No Boundary) raises P@1 by 3.9 percentage points and nDCG@10 by 1.5 points. A developer optimising on nDCG@10 would ship A2 as the best configuration. What the metrics do not record is that the retrieved chunks are now pedagogically fragmented — they come from the right chapter but no longer preserve instructional units. CAS detects this regression: all three dimensions (Grade Match, Prereq Coverage, Bloom Alignment) decline when boundary preservation is removed. This directional trade-off is the central empirical finding, and it holds regardless of where PACER ranks on absolute metric values.</w:t>
-      </w:r>
-    </w:p>
-    <w:p>
-      <w:pPr>
-        <w:pStyle w:val="Normal"/>
-      </w:pPr>
-      <w:r>
-        <w:t xml:space="preserve">One result warrants direct discussion: Recursive chunking achieves the highest absolute CAS score (0.677) among all methods, marginally above PACER (0.651). This appears to contradict PACER's pedagogical claim. The explanation lies in chunk granularity: Recursive produces small, focused chunks (avg 1,849 chars, 7,668 chunks) that align well with short factoid queries in terms of grade level and Bloom classification, even though they are not pedagogically coherent units. PACER's boundary detector preserves instructional units — definition-example pairs, question-answer structures — producing larger chunks (avg 979 chars after hybrid sub-splitting, 13,038 chunks) that score marginally lower on CAS because grade-level signals are more diluted across longer text. The critical difference is not absolute CAS score but the ablation direction: when boundary preservation is removed from PACER (A2), CAS drops consistently across all three dimensions while P@1 rises. This inverse relationship between retrieval precision and curriculum alignment — visible only through ablation, not through cross-method comparison — is what CAS makes quantifiable and what standard metrics cannot detect.</w:t>
+        <w:t xml:space="preserve">The ablation results make the limitation of standard metrics concrete. Removing the boundary detector (A2: No Boundary) raises P@1 by 3.9 percentage points and nDCG@10 by 1.5 points. </w:t>
+      </w:r>
+      <w:r>
+        <w:lastRenderedPageBreak/>
+        <w:t>A developer optimising on nDCG@10 would ship A2 as the best configuration. What the metrics do not record is that the retrieved chunks are now pedagogically fragmented — they come from the right chapter but no longer preserve instructional units. CAS detects this regression: all three dimensions (Grade Match, Prereq Coverage, Bloom Alignment) decline when boundary preservation is removed. This directional trade-off is the central empirical finding, and it holds regardless of where PACER ranks on absolute metric values.</w:t>
+      </w:r>
+    </w:p>
+    <w:p>
+      <w:r>
+        <w:t>One result warrants direct discussion: Recursive chunking achieves the highest absolute CAS score (0.677) among all methods, marginally above PACER (0.651). This appears to contradict PACER's pedagogical claim. The explanation lies in chunk granularity: Recursive produces small, focused chunks (avg 1,849 chars, 7,668 chunks) that align well with short factoid queries in terms of grade level and Bloom classification, even though they are not pedagogically coherent units. PACER's boundary detector preserves instructional units — definition-example pairs, question-answer structures — producing larger chunks (avg 979 chars after hybrid sub-splitting, 13,038 chunks) that score marginally lower on CAS because grade-level signals are more diluted across longer text. The critical difference is not absolute CAS score but the ablation direction: when boundary preservation is removed from PACER (A2), CAS drops consistently across all three dimensions while P@1 rises. This inverse relationship between retrieval precision and curriculum alignment — visible only through ablation, not through cross-method comparison — is what CAS makes quantifiable and what standard metrics cannot detect.</w:t>
       </w:r>
     </w:p>
     <w:p>
@@ -9037,15 +9018,7 @@
         <w:jc w:val="both"/>
       </w:pPr>
       <w:r>
-        <w:t>We plan to address this limitation in Phase 2 by extending the corpus to include 200+ examination papers, 150+ lecture note sets, and 100+ lesson plans from Shoolini University and partner institutions. We expect routing to show a 5–</w:t>
-      </w:r>
-      <w:proofErr w:type="gramStart"/>
-      <w:r>
-        <w:t>10 point</w:t>
-      </w:r>
-      <w:proofErr w:type="gramEnd"/>
-      <w:r>
-        <w:t xml:space="preserve"> P@1 improvement on mixed-type corpora relative to single-strategy baselines, based on the per-type performance spread visible in Table 2.</w:t>
+        <w:t>We plan to address this limitation in Phase 2 by extending the corpus to include 200+ examination papers, 150+ lecture note sets, and 100+ lesson plans from Shoolini University and partner institutions. We expect routing to show a 5–10 point P@1 improvement on mixed-type corpora relative to single-strategy baselines, based on the per-type performance spread visible in Table 2.</w:t>
       </w:r>
     </w:p>
     <w:p>
@@ -9062,7 +9035,11 @@
         <w:jc w:val="both"/>
       </w:pPr>
       <w:r>
-        <w:t>A mean Fleiss' κ of 0.546 across three independent LLM judges tells us something useful: curriculum alignment is a measurable construct, at least for two of its three dimensions. Grade Match and Prerequisite Coverage both approach or exceed κ = 0.60, the threshold we set for reliable automated assessment. This means two structurally different model families — Meta Llama and Google Gemini — largely agree on which chunks are grade-appropriate and which are not, suggesting the signal is real rather than model-specific.</w:t>
+        <w:t xml:space="preserve">A mean Fleiss' κ of 0.546 across three independent LLM judges tells us something useful: curriculum alignment is a measurable construct, at least for two of its three dimensions. Grade </w:t>
+      </w:r>
+      <w:r>
+        <w:lastRenderedPageBreak/>
+        <w:t>Match and Prerequisite Coverage both approach or exceed κ = 0.60, the threshold we set for reliable automated assessment. This means two structurally different model families — Meta Llama and Google Gemini — largely agree on which chunks are grade-appropriate and which are not, suggesting the signal is real rather than model-specific.</w:t>
       </w:r>
     </w:p>
     <w:p>
@@ -9080,7 +9057,6 @@
         <w:jc w:val="both"/>
       </w:pPr>
       <w:r>
-        <w:lastRenderedPageBreak/>
         <w:t xml:space="preserve">The strong cross-family Pearson correlations (mean r = 0.625, all p &lt; 0.0001) suggest that both model families assign similar relative rankings to chunks — they agree on which chunks are </w:t>
       </w:r>
       <w:proofErr w:type="gramStart"/>
@@ -9150,6 +9126,7 @@
         <w:jc w:val="both"/>
       </w:pPr>
       <w:r>
+        <w:lastRenderedPageBreak/>
         <w:t>Fourth, Bloom Alignment is difficult to validate reliably when query Bloom levels are unknown. The 0.439 κ reported is a lower bound; with fully Bloom-labelled queries, we expect agreement to increase to the 0.55–0.65 range.</w:t>
       </w:r>
     </w:p>
@@ -9163,11 +9140,8 @@
       </w:r>
     </w:p>
     <w:p>
-      <w:pPr>
-        <w:pStyle w:val="Normal"/>
-      </w:pPr>
-      <w:r>
-        <w:t xml:space="preserve">Seventh, no statistical significance tests are reported between methods in Table 2. Standard deviations across three random seeds are below 0.002 for all metrics, indicating stable results, but paired t-tests between methods have not been computed. Given the narrow performance spread (~4 percentage points on P@1), some pairwise differences may not reach statistical significance. Readers should interpret performance differences as indicative trends rather than definitive rankings.</w:t>
+      <w:r>
+        <w:t>Seventh, no statistical significance tests are reported between methods in Table 2. Standard deviations across three random seeds are below 0.002 for all metrics, indicating stable results, but paired t-tests between methods have not been computed. Given the narrow performance spread (~4 percentage points on P@1), some pairwise differences may not reach statistical significance. Readers should interpret performance differences as indicative trends rather than definitive rankings.</w:t>
       </w:r>
     </w:p>
     <w:p>
@@ -9211,7 +9185,11 @@
         <w:jc w:val="both"/>
       </w:pPr>
       <w:r>
-        <w:t xml:space="preserve">The central contribution of this paper is methodological: we demonstrate that standard RAG evaluation metrics are insufficient for educational deployment, and that curriculum alignment must be evaluated explicitly. The CAS metric </w:t>
+        <w:t xml:space="preserve">The central contribution of this paper is methodological: we demonstrate that standard RAG evaluation metrics are insufficient for educational deployment, and that curriculum alignment </w:t>
+      </w:r>
+      <w:r>
+        <w:lastRenderedPageBreak/>
+        <w:t xml:space="preserve">must be evaluated explicitly. The CAS metric </w:t>
       </w:r>
       <w:proofErr w:type="spellStart"/>
       <w:r>
@@ -9253,15 +9231,13 @@
         <w:jc w:val="both"/>
       </w:pPr>
       <w:r>
-        <w:t xml:space="preserve">The PACER codebase, evaluation benchmark (798 questions across 134 NCERT chapters), and CAS implementation will be released at </w:t>
-      </w:r>
-      <w:proofErr w:type="gramStart"/>
-      <w:r>
-        <w:t>https://github.com/[</w:t>
-      </w:r>
-      <w:proofErr w:type="gramEnd"/>
-      <w:r>
-        <w:t>upon acceptance].</w:t>
+        <w:t>The PACER codebase, evaluation benchmark (798 questions across 134 NCERT chapters), and CAS implementation will be released at https://github.com</w:t>
+      </w:r>
+      <w:r>
+        <w:t>/nitesh19s/edullm-pacer</w:t>
+      </w:r>
+      <w:r>
+        <w:t>.</w:t>
       </w:r>
     </w:p>
     <w:p>
@@ -9269,10 +9245,7 @@
         <w:pStyle w:val="Heading1"/>
       </w:pPr>
       <w:r>
-        <w:t>Credit</w:t>
-      </w:r>
-      <w:r>
-        <w:t xml:space="preserve"> Author Statement</w:t>
+        <w:t>Credit Author Statement</w:t>
       </w:r>
     </w:p>
     <w:p>
@@ -9333,7 +9306,6 @@
         <w:pStyle w:val="Heading1"/>
       </w:pPr>
       <w:r>
-        <w:lastRenderedPageBreak/>
         <w:t>Declaration of Competing Interest</w:t>
       </w:r>
     </w:p>
@@ -9465,6 +9437,7 @@
           <w:sz w:val="22"/>
           <w:szCs w:val="22"/>
         </w:rPr>
+        <w:lastRenderedPageBreak/>
         <w:t xml:space="preserve">[4] </w:t>
       </w:r>
       <w:r>
@@ -9898,7 +9871,6 @@
           <w:sz w:val="22"/>
           <w:szCs w:val="22"/>
         </w:rPr>
-        <w:lastRenderedPageBreak/>
         <w:t xml:space="preserve">[21] </w:t>
       </w:r>
       <w:proofErr w:type="spellStart"/>
@@ -10314,6 +10286,7 @@
           <w:sz w:val="22"/>
           <w:szCs w:val="22"/>
         </w:rPr>
+        <w:lastRenderedPageBreak/>
         <w:t xml:space="preserve">[35] </w:t>
       </w:r>
       <w:r>
@@ -10760,7 +10733,6 @@
           <w:sz w:val="22"/>
           <w:szCs w:val="22"/>
         </w:rPr>
-        <w:lastRenderedPageBreak/>
         <w:t xml:space="preserve">[53] </w:t>
       </w:r>
       <w:r>
@@ -10827,7 +10799,7 @@
 </file>
 
 <file path=word/endnotes.xml><?xml version="1.0" encoding="utf-8"?>
-<w:endnotes xmlns:wpc="http://schemas.microsoft.com/office/word/2010/wordprocessingCanvas" xmlns:cx="http://schemas.microsoft.com/office/drawing/2014/chartex" xmlns:cx1="http://schemas.microsoft.com/office/drawing/2015/9/8/chartex" xmlns:cx2="http://schemas.microsoft.com/office/drawing/2015/10/21/chartex" xmlns:cx3="http://schemas.microsoft.com/office/drawing/2016/5/9/chartex" xmlns:cx4="http://schemas.microsoft.com/office/drawing/2016/5/10/chartex" xmlns:cx5="http://schemas.microsoft.com/office/drawing/2016/5/11/chartex" xmlns:cx6="http://schemas.microsoft.com/office/drawing/2016/5/12/chartex" xmlns:cx7="http://schemas.microsoft.com/office/drawing/2016/5/13/chartex" xmlns:cx8="http://schemas.microsoft.com/office/drawing/2016/5/14/chartex" xmlns:mc="http://schemas.openxmlformats.org/markup-compatibility/2006" xmlns:aink="http://schemas.microsoft.com/office/drawing/2016/ink" xmlns:am3d="http://schemas.microsoft.com/office/drawing/2017/model3d" xmlns:o="urn:schemas-microsoft-com:office:office" xmlns:oel="http://schemas.microsoft.com/office/2019/extlst" xmlns:r="http://schemas.openxmlformats.org/officeDocument/2006/relationships" xmlns:m="http://schemas.openxmlformats.org/officeDocument/2006/math" xmlns:v="urn:schemas-microsoft-com:vml" xmlns:wp14="http://schemas.microsoft.com/office/word/2010/wordprocessingDrawing" xmlns:wp="http://schemas.openxmlformats.org/drawingml/2006/wordprocessingDrawing" xmlns:w10="urn:schemas-microsoft-com:office:word" xmlns:w="http://schemas.openxmlformats.org/wordprocessingml/2006/main" xmlns:w14="http://schemas.microsoft.com/office/word/2010/wordml" xmlns:w15="http://schemas.microsoft.com/office/word/2012/wordml" xmlns:w16cex="http://schemas.microsoft.com/office/word/2018/wordml/cex" xmlns:w16cid="http://schemas.microsoft.com/office/word/2016/wordml/cid" xmlns:w16="http://schemas.microsoft.com/office/word/2018/wordml" xmlns:w16du="http://schemas.microsoft.com/office/word/2023/wordml/word16du" xmlns:w16sdtdh="http://schemas.microsoft.com/office/word/2020/wordml/sdtdatahash" xmlns:w16sdtfl="http://schemas.microsoft.com/office/word/2024/wordml/sdtformatlock" xmlns:w16se="http://schemas.microsoft.com/office/word/2015/wordml/symex" xmlns:wpg="http://schemas.microsoft.com/office/word/2010/wordprocessingGroup" xmlns:wpi="http://schemas.microsoft.com/office/word/2010/wordprocessingInk" xmlns:wne="http://schemas.microsoft.com/office/word/2006/wordml" xmlns:wps="http://schemas.microsoft.com/office/word/2010/wordprocessingShape" mc:Ignorable="w14 w15 w16se w16cid w16 w16cex w16sdtdh w16sdtfl w16du wp14">
+<w:endnotes xmlns:wpc="http://schemas.microsoft.com/office/word/2010/wordprocessingCanvas" xmlns:cx="http://schemas.microsoft.com/office/drawing/2014/chartex" xmlns:cx1="http://schemas.microsoft.com/office/drawing/2015/9/8/chartex" xmlns:cx2="http://schemas.microsoft.com/office/drawing/2015/10/21/chartex" xmlns:cx3="http://schemas.microsoft.com/office/drawing/2016/5/9/chartex" xmlns:cx4="http://schemas.microsoft.com/office/drawing/2016/5/10/chartex" xmlns:cx5="http://schemas.microsoft.com/office/drawing/2016/5/11/chartex" xmlns:cx6="http://schemas.microsoft.com/office/drawing/2016/5/12/chartex" xmlns:cx7="http://schemas.microsoft.com/office/drawing/2016/5/13/chartex" xmlns:cx8="http://schemas.microsoft.com/office/drawing/2016/5/14/chartex" xmlns:mc="http://schemas.openxmlformats.org/markup-compatibility/2006" xmlns:m="http://schemas.openxmlformats.org/officeDocument/2006/math" xmlns:aink="http://schemas.microsoft.com/office/drawing/2016/ink" xmlns:am3d="http://schemas.microsoft.com/office/drawing/2017/model3d" xmlns:oel="http://schemas.microsoft.com/office/2019/extlst" xmlns:r="http://schemas.openxmlformats.org/officeDocument/2006/relationships" xmlns:wp14="http://schemas.microsoft.com/office/word/2010/wordprocessingDrawing" xmlns:wp="http://schemas.openxmlformats.org/drawingml/2006/wordprocessingDrawing" xmlns:wpg="http://schemas.microsoft.com/office/word/2010/wordprocessingGroup" xmlns:wpi="http://schemas.microsoft.com/office/word/2010/wordprocessingInk" xmlns:wps="http://schemas.microsoft.com/office/word/2010/wordprocessingShape" xmlns:o="urn:schemas-microsoft-com:office:office" xmlns:v="urn:schemas-microsoft-com:vml" xmlns:w10="urn:schemas-microsoft-com:office:word" xmlns:w="http://schemas.openxmlformats.org/wordprocessingml/2006/main" xmlns:w14="http://schemas.microsoft.com/office/word/2010/wordml" xmlns:w15="http://schemas.microsoft.com/office/word/2012/wordml" xmlns:w16cei="http://schemas.microsoft.com/office/word/2026/wordml/cei" xmlns:w16cex="http://schemas.microsoft.com/office/word/2018/wordml/cex" xmlns:w16cid="http://schemas.microsoft.com/office/word/2016/wordml/cid" xmlns:w16="http://schemas.microsoft.com/office/word/2018/wordml" xmlns:w16sdtdh="http://schemas.microsoft.com/office/word/2020/wordml/sdtdatahash" xmlns:w16sdtfl="http://schemas.microsoft.com/office/word/2024/wordml/sdtformatlock" xmlns:w16se="http://schemas.microsoft.com/office/word/2015/wordml/symex" xmlns:w16du="http://schemas.microsoft.com/office/word/2023/wordml/word16du" xmlns:wne="http://schemas.microsoft.com/office/word/2006/wordml" mc:Ignorable="w14 w15 w16se w16cid w16 w16cex w16sdtdh w16sdtfl w16du wp14">
   <w:endnote w:type="separator" w:id="-1">
     <w:p>
       <w:r>
@@ -10846,7 +10818,7 @@
 </file>
 
 <file path=word/footer1.xml><?xml version="1.0" encoding="utf-8"?>
-<w:ftr xmlns:wpc="http://schemas.microsoft.com/office/word/2010/wordprocessingCanvas" xmlns:cx="http://schemas.microsoft.com/office/drawing/2014/chartex" xmlns:cx1="http://schemas.microsoft.com/office/drawing/2015/9/8/chartex" xmlns:cx2="http://schemas.microsoft.com/office/drawing/2015/10/21/chartex" xmlns:cx3="http://schemas.microsoft.com/office/drawing/2016/5/9/chartex" xmlns:cx4="http://schemas.microsoft.com/office/drawing/2016/5/10/chartex" xmlns:cx5="http://schemas.microsoft.com/office/drawing/2016/5/11/chartex" xmlns:cx6="http://schemas.microsoft.com/office/drawing/2016/5/12/chartex" xmlns:cx7="http://schemas.microsoft.com/office/drawing/2016/5/13/chartex" xmlns:cx8="http://schemas.microsoft.com/office/drawing/2016/5/14/chartex" xmlns:mc="http://schemas.openxmlformats.org/markup-compatibility/2006" xmlns:aink="http://schemas.microsoft.com/office/drawing/2016/ink" xmlns:am3d="http://schemas.microsoft.com/office/drawing/2017/model3d" xmlns:o="urn:schemas-microsoft-com:office:office" xmlns:oel="http://schemas.microsoft.com/office/2019/extlst" xmlns:r="http://schemas.openxmlformats.org/officeDocument/2006/relationships" xmlns:m="http://schemas.openxmlformats.org/officeDocument/2006/math" xmlns:v="urn:schemas-microsoft-com:vml" xmlns:wp14="http://schemas.microsoft.com/office/word/2010/wordprocessingDrawing" xmlns:wp="http://schemas.openxmlformats.org/drawingml/2006/wordprocessingDrawing" xmlns:w10="urn:schemas-microsoft-com:office:word" xmlns:w="http://schemas.openxmlformats.org/wordprocessingml/2006/main" xmlns:w14="http://schemas.microsoft.com/office/word/2010/wordml" xmlns:w15="http://schemas.microsoft.com/office/word/2012/wordml" xmlns:w16cex="http://schemas.microsoft.com/office/word/2018/wordml/cex" xmlns:w16cid="http://schemas.microsoft.com/office/word/2016/wordml/cid" xmlns:w16="http://schemas.microsoft.com/office/word/2018/wordml" xmlns:w16du="http://schemas.microsoft.com/office/word/2023/wordml/word16du" xmlns:w16sdtdh="http://schemas.microsoft.com/office/word/2020/wordml/sdtdatahash" xmlns:w16sdtfl="http://schemas.microsoft.com/office/word/2024/wordml/sdtformatlock" xmlns:w16se="http://schemas.microsoft.com/office/word/2015/wordml/symex" xmlns:wpg="http://schemas.microsoft.com/office/word/2010/wordprocessingGroup" xmlns:wpi="http://schemas.microsoft.com/office/word/2010/wordprocessingInk" xmlns:wne="http://schemas.microsoft.com/office/word/2006/wordml" xmlns:wps="http://schemas.microsoft.com/office/word/2010/wordprocessingShape" mc:Ignorable="w14 w15 w16se w16cid w16 w16cex w16sdtdh w16sdtfl w16du wp14">
+<w:ftr xmlns:wpc="http://schemas.microsoft.com/office/word/2010/wordprocessingCanvas" xmlns:cx="http://schemas.microsoft.com/office/drawing/2014/chartex" xmlns:cx1="http://schemas.microsoft.com/office/drawing/2015/9/8/chartex" xmlns:cx2="http://schemas.microsoft.com/office/drawing/2015/10/21/chartex" xmlns:cx3="http://schemas.microsoft.com/office/drawing/2016/5/9/chartex" xmlns:cx4="http://schemas.microsoft.com/office/drawing/2016/5/10/chartex" xmlns:cx5="http://schemas.microsoft.com/office/drawing/2016/5/11/chartex" xmlns:cx6="http://schemas.microsoft.com/office/drawing/2016/5/12/chartex" xmlns:cx7="http://schemas.microsoft.com/office/drawing/2016/5/13/chartex" xmlns:cx8="http://schemas.microsoft.com/office/drawing/2016/5/14/chartex" xmlns:mc="http://schemas.openxmlformats.org/markup-compatibility/2006" xmlns:m="http://schemas.openxmlformats.org/officeDocument/2006/math" xmlns:aink="http://schemas.microsoft.com/office/drawing/2016/ink" xmlns:am3d="http://schemas.microsoft.com/office/drawing/2017/model3d" xmlns:oel="http://schemas.microsoft.com/office/2019/extlst" xmlns:r="http://schemas.openxmlformats.org/officeDocument/2006/relationships" xmlns:wp14="http://schemas.microsoft.com/office/word/2010/wordprocessingDrawing" xmlns:wp="http://schemas.openxmlformats.org/drawingml/2006/wordprocessingDrawing" xmlns:wpg="http://schemas.microsoft.com/office/word/2010/wordprocessingGroup" xmlns:wpi="http://schemas.microsoft.com/office/word/2010/wordprocessingInk" xmlns:wps="http://schemas.microsoft.com/office/word/2010/wordprocessingShape" xmlns:o="urn:schemas-microsoft-com:office:office" xmlns:v="urn:schemas-microsoft-com:vml" xmlns:w10="urn:schemas-microsoft-com:office:word" xmlns:w="http://schemas.openxmlformats.org/wordprocessingml/2006/main" xmlns:w14="http://schemas.microsoft.com/office/word/2010/wordml" xmlns:w15="http://schemas.microsoft.com/office/word/2012/wordml" xmlns:w16cei="http://schemas.microsoft.com/office/word/2026/wordml/cei" xmlns:w16cex="http://schemas.microsoft.com/office/word/2018/wordml/cex" xmlns:w16cid="http://schemas.microsoft.com/office/word/2016/wordml/cid" xmlns:w16="http://schemas.microsoft.com/office/word/2018/wordml" xmlns:w16sdtdh="http://schemas.microsoft.com/office/word/2020/wordml/sdtdatahash" xmlns:w16sdtfl="http://schemas.microsoft.com/office/word/2024/wordml/sdtformatlock" xmlns:w16se="http://schemas.microsoft.com/office/word/2015/wordml/symex" xmlns:w16du="http://schemas.microsoft.com/office/word/2023/wordml/word16du" xmlns:wne="http://schemas.microsoft.com/office/word/2006/wordml" mc:Ignorable="w14 w15 w16se w16cid w16 w16cex w16sdtdh w16sdtfl w16du wp14">
   <w:p>
     <w:pPr>
       <w:jc w:val="center"/>
@@ -10892,7 +10864,7 @@
 </file>
 
 <file path=word/footnotes.xml><?xml version="1.0" encoding="utf-8"?>
-<w:footnotes xmlns:wpc="http://schemas.microsoft.com/office/word/2010/wordprocessingCanvas" xmlns:cx="http://schemas.microsoft.com/office/drawing/2014/chartex" xmlns:cx1="http://schemas.microsoft.com/office/drawing/2015/9/8/chartex" xmlns:cx2="http://schemas.microsoft.com/office/drawing/2015/10/21/chartex" xmlns:cx3="http://schemas.microsoft.com/office/drawing/2016/5/9/chartex" xmlns:cx4="http://schemas.microsoft.com/office/drawing/2016/5/10/chartex" xmlns:cx5="http://schemas.microsoft.com/office/drawing/2016/5/11/chartex" xmlns:cx6="http://schemas.microsoft.com/office/drawing/2016/5/12/chartex" xmlns:cx7="http://schemas.microsoft.com/office/drawing/2016/5/13/chartex" xmlns:cx8="http://schemas.microsoft.com/office/drawing/2016/5/14/chartex" xmlns:mc="http://schemas.openxmlformats.org/markup-compatibility/2006" xmlns:aink="http://schemas.microsoft.com/office/drawing/2016/ink" xmlns:am3d="http://schemas.microsoft.com/office/drawing/2017/model3d" xmlns:o="urn:schemas-microsoft-com:office:office" xmlns:oel="http://schemas.microsoft.com/office/2019/extlst" xmlns:r="http://schemas.openxmlformats.org/officeDocument/2006/relationships" xmlns:m="http://schemas.openxmlformats.org/officeDocument/2006/math" xmlns:v="urn:schemas-microsoft-com:vml" xmlns:wp14="http://schemas.microsoft.com/office/word/2010/wordprocessingDrawing" xmlns:wp="http://schemas.openxmlformats.org/drawingml/2006/wordprocessingDrawing" xmlns:w10="urn:schemas-microsoft-com:office:word" xmlns:w="http://schemas.openxmlformats.org/wordprocessingml/2006/main" xmlns:w14="http://schemas.microsoft.com/office/word/2010/wordml" xmlns:w15="http://schemas.microsoft.com/office/word/2012/wordml" xmlns:w16cex="http://schemas.microsoft.com/office/word/2018/wordml/cex" xmlns:w16cid="http://schemas.microsoft.com/office/word/2016/wordml/cid" xmlns:w16="http://schemas.microsoft.com/office/word/2018/wordml" xmlns:w16du="http://schemas.microsoft.com/office/word/2023/wordml/word16du" xmlns:w16sdtdh="http://schemas.microsoft.com/office/word/2020/wordml/sdtdatahash" xmlns:w16sdtfl="http://schemas.microsoft.com/office/word/2024/wordml/sdtformatlock" xmlns:w16se="http://schemas.microsoft.com/office/word/2015/wordml/symex" xmlns:wpg="http://schemas.microsoft.com/office/word/2010/wordprocessingGroup" xmlns:wpi="http://schemas.microsoft.com/office/word/2010/wordprocessingInk" xmlns:wne="http://schemas.microsoft.com/office/word/2006/wordml" xmlns:wps="http://schemas.microsoft.com/office/word/2010/wordprocessingShape" mc:Ignorable="w14 w15 w16se w16cid w16 w16cex w16sdtdh w16sdtfl w16du wp14">
+<w:footnotes xmlns:wpc="http://schemas.microsoft.com/office/word/2010/wordprocessingCanvas" xmlns:cx="http://schemas.microsoft.com/office/drawing/2014/chartex" xmlns:cx1="http://schemas.microsoft.com/office/drawing/2015/9/8/chartex" xmlns:cx2="http://schemas.microsoft.com/office/drawing/2015/10/21/chartex" xmlns:cx3="http://schemas.microsoft.com/office/drawing/2016/5/9/chartex" xmlns:cx4="http://schemas.microsoft.com/office/drawing/2016/5/10/chartex" xmlns:cx5="http://schemas.microsoft.com/office/drawing/2016/5/11/chartex" xmlns:cx6="http://schemas.microsoft.com/office/drawing/2016/5/12/chartex" xmlns:cx7="http://schemas.microsoft.com/office/drawing/2016/5/13/chartex" xmlns:cx8="http://schemas.microsoft.com/office/drawing/2016/5/14/chartex" xmlns:mc="http://schemas.openxmlformats.org/markup-compatibility/2006" xmlns:m="http://schemas.openxmlformats.org/officeDocument/2006/math" xmlns:aink="http://schemas.microsoft.com/office/drawing/2016/ink" xmlns:am3d="http://schemas.microsoft.com/office/drawing/2017/model3d" xmlns:oel="http://schemas.microsoft.com/office/2019/extlst" xmlns:r="http://schemas.openxmlformats.org/officeDocument/2006/relationships" xmlns:wp14="http://schemas.microsoft.com/office/word/2010/wordprocessingDrawing" xmlns:wp="http://schemas.openxmlformats.org/drawingml/2006/wordprocessingDrawing" xmlns:wpg="http://schemas.microsoft.com/office/word/2010/wordprocessingGroup" xmlns:wpi="http://schemas.microsoft.com/office/word/2010/wordprocessingInk" xmlns:wps="http://schemas.microsoft.com/office/word/2010/wordprocessingShape" xmlns:o="urn:schemas-microsoft-com:office:office" xmlns:v="urn:schemas-microsoft-com:vml" xmlns:w10="urn:schemas-microsoft-com:office:word" xmlns:w="http://schemas.openxmlformats.org/wordprocessingml/2006/main" xmlns:w14="http://schemas.microsoft.com/office/word/2010/wordml" xmlns:w15="http://schemas.microsoft.com/office/word/2012/wordml" xmlns:w16cei="http://schemas.microsoft.com/office/word/2026/wordml/cei" xmlns:w16cex="http://schemas.microsoft.com/office/word/2018/wordml/cex" xmlns:w16cid="http://schemas.microsoft.com/office/word/2016/wordml/cid" xmlns:w16="http://schemas.microsoft.com/office/word/2018/wordml" xmlns:w16sdtdh="http://schemas.microsoft.com/office/word/2020/wordml/sdtdatahash" xmlns:w16sdtfl="http://schemas.microsoft.com/office/word/2024/wordml/sdtformatlock" xmlns:w16se="http://schemas.microsoft.com/office/word/2015/wordml/symex" xmlns:w16du="http://schemas.microsoft.com/office/word/2023/wordml/word16du" xmlns:wne="http://schemas.microsoft.com/office/word/2006/wordml" mc:Ignorable="w14 w15 w16se w16cid w16 w16cex w16sdtdh w16sdtfl w16du wp14">
   <w:footnote w:type="separator" w:id="-1">
     <w:p>
       <w:r>
@@ -10911,7 +10883,7 @@
 </file>
 
 <file path=word/numbering.xml><?xml version="1.0" encoding="utf-8"?>
-<w:numbering xmlns:wpc="http://schemas.microsoft.com/office/word/2010/wordprocessingCanvas" xmlns:cx="http://schemas.microsoft.com/office/drawing/2014/chartex" xmlns:cx1="http://schemas.microsoft.com/office/drawing/2015/9/8/chartex" xmlns:cx2="http://schemas.microsoft.com/office/drawing/2015/10/21/chartex" xmlns:cx3="http://schemas.microsoft.com/office/drawing/2016/5/9/chartex" xmlns:cx4="http://schemas.microsoft.com/office/drawing/2016/5/10/chartex" xmlns:cx5="http://schemas.microsoft.com/office/drawing/2016/5/11/chartex" xmlns:cx6="http://schemas.microsoft.com/office/drawing/2016/5/12/chartex" xmlns:cx7="http://schemas.microsoft.com/office/drawing/2016/5/13/chartex" xmlns:cx8="http://schemas.microsoft.com/office/drawing/2016/5/14/chartex" xmlns:mc="http://schemas.openxmlformats.org/markup-compatibility/2006" xmlns:aink="http://schemas.microsoft.com/office/drawing/2016/ink" xmlns:am3d="http://schemas.microsoft.com/office/drawing/2017/model3d" xmlns:o="urn:schemas-microsoft-com:office:office" xmlns:oel="http://schemas.microsoft.com/office/2019/extlst" xmlns:r="http://schemas.openxmlformats.org/officeDocument/2006/relationships" xmlns:m="http://schemas.openxmlformats.org/officeDocument/2006/math" xmlns:v="urn:schemas-microsoft-com:vml" xmlns:wp14="http://schemas.microsoft.com/office/word/2010/wordprocessingDrawing" xmlns:wp="http://schemas.openxmlformats.org/drawingml/2006/wordprocessingDrawing" xmlns:w10="urn:schemas-microsoft-com:office:word" xmlns:w="http://schemas.openxmlformats.org/wordprocessingml/2006/main" xmlns:w14="http://schemas.microsoft.com/office/word/2010/wordml" xmlns:w15="http://schemas.microsoft.com/office/word/2012/wordml" xmlns:w16cex="http://schemas.microsoft.com/office/word/2018/wordml/cex" xmlns:w16cid="http://schemas.microsoft.com/office/word/2016/wordml/cid" xmlns:w16="http://schemas.microsoft.com/office/word/2018/wordml" xmlns:w16du="http://schemas.microsoft.com/office/word/2023/wordml/word16du" xmlns:w16sdtdh="http://schemas.microsoft.com/office/word/2020/wordml/sdtdatahash" xmlns:w16sdtfl="http://schemas.microsoft.com/office/word/2024/wordml/sdtformatlock" xmlns:w16se="http://schemas.microsoft.com/office/word/2015/wordml/symex" xmlns:wpg="http://schemas.microsoft.com/office/word/2010/wordprocessingGroup" xmlns:wpi="http://schemas.microsoft.com/office/word/2010/wordprocessingInk" xmlns:wne="http://schemas.microsoft.com/office/word/2006/wordml" xmlns:wps="http://schemas.microsoft.com/office/word/2010/wordprocessingShape" mc:Ignorable="w14 w15 w16se w16cid w16 w16cex w16sdtdh w16sdtfl w16du wp14">
+<w:numbering xmlns:wpc="http://schemas.microsoft.com/office/word/2010/wordprocessingCanvas" xmlns:cx="http://schemas.microsoft.com/office/drawing/2014/chartex" xmlns:cx1="http://schemas.microsoft.com/office/drawing/2015/9/8/chartex" xmlns:cx2="http://schemas.microsoft.com/office/drawing/2015/10/21/chartex" xmlns:cx3="http://schemas.microsoft.com/office/drawing/2016/5/9/chartex" xmlns:cx4="http://schemas.microsoft.com/office/drawing/2016/5/10/chartex" xmlns:cx5="http://schemas.microsoft.com/office/drawing/2016/5/11/chartex" xmlns:cx6="http://schemas.microsoft.com/office/drawing/2016/5/12/chartex" xmlns:cx7="http://schemas.microsoft.com/office/drawing/2016/5/13/chartex" xmlns:cx8="http://schemas.microsoft.com/office/drawing/2016/5/14/chartex" xmlns:mc="http://schemas.openxmlformats.org/markup-compatibility/2006" xmlns:m="http://schemas.openxmlformats.org/officeDocument/2006/math" xmlns:aink="http://schemas.microsoft.com/office/drawing/2016/ink" xmlns:am3d="http://schemas.microsoft.com/office/drawing/2017/model3d" xmlns:oel="http://schemas.microsoft.com/office/2019/extlst" xmlns:r="http://schemas.openxmlformats.org/officeDocument/2006/relationships" xmlns:wp14="http://schemas.microsoft.com/office/word/2010/wordprocessingDrawing" xmlns:wp="http://schemas.openxmlformats.org/drawingml/2006/wordprocessingDrawing" xmlns:wpg="http://schemas.microsoft.com/office/word/2010/wordprocessingGroup" xmlns:wpi="http://schemas.microsoft.com/office/word/2010/wordprocessingInk" xmlns:wps="http://schemas.microsoft.com/office/word/2010/wordprocessingShape" xmlns:o="urn:schemas-microsoft-com:office:office" xmlns:v="urn:schemas-microsoft-com:vml" xmlns:w10="urn:schemas-microsoft-com:office:word" xmlns:w="http://schemas.openxmlformats.org/wordprocessingml/2006/main" xmlns:w14="http://schemas.microsoft.com/office/word/2010/wordml" xmlns:w15="http://schemas.microsoft.com/office/word/2012/wordml" xmlns:w16cei="http://schemas.microsoft.com/office/word/2026/wordml/cei" xmlns:w16cex="http://schemas.microsoft.com/office/word/2018/wordml/cex" xmlns:w16cid="http://schemas.microsoft.com/office/word/2016/wordml/cid" xmlns:w16="http://schemas.microsoft.com/office/word/2018/wordml" xmlns:w16sdtdh="http://schemas.microsoft.com/office/word/2020/wordml/sdtdatahash" xmlns:w16sdtfl="http://schemas.microsoft.com/office/word/2024/wordml/sdtformatlock" xmlns:w16se="http://schemas.microsoft.com/office/word/2015/wordml/symex" xmlns:w16du="http://schemas.microsoft.com/office/word/2023/wordml/word16du" xmlns:wne="http://schemas.microsoft.com/office/word/2006/wordml" mc:Ignorable="w14 w15 w16se w16cid w16 w16cex w16sdtdh w16sdtfl w16du wp14">
   <w:abstractNum w:abstractNumId="0" w15:restartNumberingAfterBreak="0">
     <w:nsid w:val="13F53F39"/>
     <w:multiLevelType w:val="hybridMultilevel"/>
@@ -11008,7 +10980,7 @@
 </file>
 
 <file path=word/styles.xml><?xml version="1.0" encoding="utf-8"?>
-<w:styles xmlns:mc="http://schemas.openxmlformats.org/markup-compatibility/2006" xmlns:r="http://schemas.openxmlformats.org/officeDocument/2006/relationships" xmlns:w="http://schemas.openxmlformats.org/wordprocessingml/2006/main" xmlns:w14="http://schemas.microsoft.com/office/word/2010/wordml" xmlns:w15="http://schemas.microsoft.com/office/word/2012/wordml" xmlns:w16cex="http://schemas.microsoft.com/office/word/2018/wordml/cex" xmlns:w16cid="http://schemas.microsoft.com/office/word/2016/wordml/cid" xmlns:w16="http://schemas.microsoft.com/office/word/2018/wordml" xmlns:w16du="http://schemas.microsoft.com/office/word/2023/wordml/word16du" xmlns:w16sdtdh="http://schemas.microsoft.com/office/word/2020/wordml/sdtdatahash" xmlns:w16sdtfl="http://schemas.microsoft.com/office/word/2024/wordml/sdtformatlock" xmlns:w16se="http://schemas.microsoft.com/office/word/2015/wordml/symex" mc:Ignorable="w14 w15 w16se w16cid w16 w16cex w16sdtdh w16sdtfl w16du">
+<w:styles xmlns:mc="http://schemas.openxmlformats.org/markup-compatibility/2006" xmlns:r="http://schemas.openxmlformats.org/officeDocument/2006/relationships" xmlns:w="http://schemas.openxmlformats.org/wordprocessingml/2006/main" xmlns:w14="http://schemas.microsoft.com/office/word/2010/wordml" xmlns:w15="http://schemas.microsoft.com/office/word/2012/wordml" xmlns:w16cex="http://schemas.microsoft.com/office/word/2018/wordml/cex" xmlns:w16cid="http://schemas.microsoft.com/office/word/2016/wordml/cid" xmlns:w16="http://schemas.microsoft.com/office/word/2018/wordml" xmlns:w16sdtdh="http://schemas.microsoft.com/office/word/2020/wordml/sdtdatahash" xmlns:w16sdtfl="http://schemas.microsoft.com/office/word/2024/wordml/sdtformatlock" xmlns:w16se="http://schemas.microsoft.com/office/word/2015/wordml/symex" xmlns:w16du="http://schemas.microsoft.com/office/word/2023/wordml/word16du" mc:Ignorable="w14 w15 w16se w16cid w16 w16cex w16sdtdh w16sdtfl w16du">
   <w:docDefaults>
     <w:rPrDefault>
       <w:rPr>

</xml_diff>